<commit_message>
add finished volume1 chapter3&4
</commit_message>
<xml_diff>
--- a/เทพปีศาจหวนคืน โดยกู่เจินเหริน.docx
+++ b/เทพปีศาจหวนคืน โดยกู่เจินเหริน.docx
@@ -5131,45 +5131,7 @@
           <w:shd w:fill="auto" w:val="clear"/>
           <w:lang w:bidi="th-TH"/>
         </w:rPr>
-        <w:t xml:space="preserve">เขากำลังหันหน้าเข้าหาแท่นบูชา </w:t>
-      </w:r>
-      <w:r>
-        <w:rPr>
-          <w:rFonts w:ascii="Noto Serif Thai" w:hAnsi="Noto Serif Thai" w:cs="Noto Serif Thai"/>
-          <w:bCs w:val="false"/>
-          <w:iCs w:val="false"/>
-          <w:caps w:val="false"/>
-          <w:smallCaps w:val="false"/>
-          <w:strike w:val="false"/>
-          <w:dstrike w:val="false"/>
-          <w:color w:val="000000"/>
-          <w:sz w:val="32"/>
-          <w:szCs w:val="32"/>
-          <w:u w:val="none"/>
-          <w:effect w:val="none"/>
-          <w:shd w:fill="auto" w:val="clear"/>
-          <w:lang w:bidi="th-TH"/>
-        </w:rPr>
-        <w:t>แท่นบูชานั้น</w:t>
-      </w:r>
-      <w:r>
-        <w:rPr>
-          <w:rFonts w:ascii="Noto Serif Thai" w:hAnsi="Noto Serif Thai" w:cs="Noto Serif Thai"/>
-          <w:bCs w:val="false"/>
-          <w:iCs w:val="false"/>
-          <w:caps w:val="false"/>
-          <w:smallCaps w:val="false"/>
-          <w:strike w:val="false"/>
-          <w:dstrike w:val="false"/>
-          <w:color w:val="000000"/>
-          <w:sz w:val="32"/>
-          <w:szCs w:val="32"/>
-          <w:u w:val="none"/>
-          <w:effect w:val="none"/>
-          <w:shd w:fill="auto" w:val="clear"/>
-          <w:lang w:bidi="th-TH"/>
-        </w:rPr>
-        <w:t>มีสามชั้น แต่ละชั้นประดิษฐานป้ายวิญญาณของบรรพชน ทั้งสองฝั่งของกลุ่มป้ายวิญญาณมีธูปทองแดงวางอยู่และปล่อยควันลอยขึ้นสู่ท้องฟ้า</w:t>
+        <w:t>เขากำลังหันหน้าเข้าหาแท่นบูชา แท่นบูชานั้นมีสามชั้น แต่ละชั้นประดิษฐานป้ายวิญญาณของบรรพชน ทั้งสองฝั่งของกลุ่มป้ายวิญญาณมีธูปทองแดงวางอยู่และปล่อยควันลอยขึ้นสู่ท้องฟ้า</w:t>
       </w:r>
     </w:p>
     <w:p>
@@ -17944,28 +17906,48 @@
         </w:rPr>
         <w:t>กู่เยว่ฟางหยวน</w:t>
       </w:r>
-    </w:p>
-    <w:p>
-      <w:pPr>
-        <w:pStyle w:val="BodyText"/>
-        <w:bidi w:val="0"/>
-        <w:jc w:val="start"/>
-        <w:rPr>
-          <w:rFonts w:ascii="Angsana New" w:hAnsi="Angsana New" w:cs="Angsana New"/>
-          <w:b w:val="false"/>
-          <w:bCs w:val="false"/>
+      <w:r>
+        <w:rPr>
+          <w:rFonts w:cs="Angsana New" w:ascii="Angsana New" w:hAnsi="Angsana New"/>
+          <w:b w:val="false"/>
+          <w:bCs w:val="false"/>
+          <w:i w:val="false"/>
+          <w:caps w:val="false"/>
+          <w:smallCaps w:val="false"/>
+          <w:strike w:val="false"/>
+          <w:dstrike w:val="false"/>
+          <w:color w:val="000000"/>
           <w:sz w:val="60"/>
           <w:szCs w:val="60"/>
-        </w:rPr>
-      </w:pPr>
-      <w:r>
-        <w:rPr>
-          <w:rFonts w:cs="Angsana New" w:ascii="Angsana New" w:hAnsi="Angsana New"/>
+          <w:u w:val="none"/>
+          <w:effect w:val="none"/>
+          <w:shd w:fill="auto" w:val="clear"/>
+          <w:lang w:bidi="th-TH"/>
+        </w:rPr>
+        <w:t>!</w:t>
+      </w:r>
+    </w:p>
+    <w:p>
+      <w:pPr>
+        <w:pStyle w:val="BodyText"/>
+        <w:bidi w:val="0"/>
+        <w:jc w:val="start"/>
+        <w:rPr>
+          <w:rFonts w:ascii="Angsana New" w:hAnsi="Angsana New" w:cs="Angsana New"/>
           <w:b w:val="false"/>
           <w:bCs w:val="false"/>
           <w:sz w:val="60"/>
           <w:szCs w:val="60"/>
         </w:rPr>
+      </w:pPr>
+      <w:r>
+        <w:rPr>
+          <w:rFonts w:cs="Angsana New" w:ascii="Angsana New" w:hAnsi="Angsana New"/>
+          <w:b w:val="false"/>
+          <w:bCs w:val="false"/>
+          <w:sz w:val="60"/>
+          <w:szCs w:val="60"/>
+        </w:rPr>
       </w:r>
     </w:p>
     <w:p>
@@ -18033,7 +18015,34 @@
           <w:szCs w:val="32"/>
           <w:lang w:bidi="th-TH"/>
         </w:rPr>
-        <w:t>เด็กสาวอายุสิบห้าปีมากกว่าร้อยคนรวมตัวกันที่หน้าหอประมุข</w:t>
+        <w:t>หนุ่ม</w:t>
+      </w:r>
+      <w:r>
+        <w:rPr>
+          <w:rFonts w:cs="Noto Serif Thai"/>
+          <w:sz w:val="32"/>
+          <w:szCs w:val="32"/>
+          <w:lang w:bidi="th-TH"/>
+        </w:rPr>
+        <w:t>สาว</w:t>
+      </w:r>
+      <w:r>
+        <w:rPr>
+          <w:rFonts w:cs="Noto Serif Thai"/>
+          <w:sz w:val="32"/>
+          <w:szCs w:val="32"/>
+          <w:lang w:bidi="th-TH"/>
+        </w:rPr>
+        <w:t>วัย</w:t>
+      </w:r>
+      <w:r>
+        <w:rPr>
+          <w:rFonts w:cs="Noto Serif Thai"/>
+          <w:sz w:val="32"/>
+          <w:szCs w:val="32"/>
+          <w:lang w:bidi="th-TH"/>
+        </w:rPr>
+        <w:t>สิบห้าปีมากกว่าร้อยคนรวมตัวกันที่หน้าหอประมุข</w:t>
       </w:r>
     </w:p>
     <w:p>
@@ -18132,52 +18141,7 @@
           <w:szCs w:val="32"/>
           <w:lang w:bidi="th-TH"/>
         </w:rPr>
-        <w:t>ยอดเยี่ยม พวกเจ้าทุกคนตรงต่อเวลา วันนี้คือวันสำหรับพิธีเบิกทวาร มัน</w:t>
-      </w:r>
-      <w:r>
-        <w:rPr>
-          <w:rFonts w:cs="Noto Serif Thai"/>
-          <w:sz w:val="32"/>
-          <w:szCs w:val="32"/>
-          <w:lang w:bidi="th-TH"/>
-        </w:rPr>
-        <w:t>จะเป็น</w:t>
-      </w:r>
-      <w:r>
-        <w:rPr>
-          <w:rFonts w:cs="Noto Serif Thai"/>
-          <w:sz w:val="32"/>
-          <w:szCs w:val="32"/>
-          <w:lang w:bidi="th-TH"/>
-        </w:rPr>
-        <w:t>จุดเปลี่ยนครั้งสำคัญในชีวิตของพวกเจ้า ข้าจะไม่พูด</w:t>
-      </w:r>
-      <w:r>
-        <w:rPr>
-          <w:rFonts w:cs="Noto Serif Thai"/>
-          <w:sz w:val="32"/>
-          <w:szCs w:val="32"/>
-          <w:lang w:bidi="th-TH"/>
-        </w:rPr>
-        <w:t>พร่ำทำเพลงให้มากความ</w:t>
-      </w:r>
-      <w:r>
-        <w:rPr>
-          <w:rFonts w:cs="Noto Serif Thai"/>
-          <w:sz w:val="32"/>
-          <w:szCs w:val="32"/>
-          <w:lang w:bidi="th-TH"/>
-        </w:rPr>
-        <w:t xml:space="preserve"> จงตามข้ามา” </w:t>
-      </w:r>
-      <w:r>
-        <w:rPr>
-          <w:rFonts w:cs="Noto Serif Thai"/>
-          <w:sz w:val="32"/>
-          <w:szCs w:val="32"/>
-          <w:lang w:bidi="th-TH"/>
-        </w:rPr>
-        <w:t>ผู้ที่รับผิดชอบการนำทางในตอนนี้นั้นคือผู้อาวุโสท่านหนึ่งจากสถานศึกษาของตระกูล แม้เส้นผมและหนวดเคราของเขาจะขาวโพลน ทว่าท่าทีกลับยังคงดูกระฉับกระเฉงกระชุ่มกระชวยขณะที่เดินนำเหล่าวัยรุ่นเข้าไปในหอประมุข</w:t>
+        <w:t>ยอดเยี่ยม พวกเจ้าทุกคนตรงต่อเวลา วันนี้คือวันสำหรับพิธีเบิกทวาร มันจะเป็นจุดเปลี่ยนครั้งสำคัญในชีวิตของพวกเจ้า ข้าจะไม่พูดพร่ำทำเพลงให้มากความ จงตามข้ามา” ผู้ที่รับผิดชอบการนำทางในตอนนี้นั้นคือผู้อาวุโสท่านหนึ่งจากสถานศึกษาของตระกูล แม้เส้นผมและหนวดเคราของเขาจะขาวโพลน ทว่าท่าทีกลับยังคงดูกระฉับกระเฉงกระชุ่มกระชวยขณะที่เดินนำเหล่าวัยรุ่นเข้าไปในหอประมุข</w:t>
       </w:r>
     </w:p>
     <w:p>
@@ -18254,79 +18218,34 @@
           <w:szCs w:val="32"/>
           <w:lang w:bidi="th-TH"/>
         </w:rPr>
-        <w:t>อนุชนต่าง</w:t>
-      </w:r>
-      <w:r>
-        <w:rPr>
-          <w:rFonts w:cs="Noto Serif Thai"/>
-          <w:sz w:val="32"/>
-          <w:szCs w:val="32"/>
-          <w:lang w:bidi="th-TH"/>
-        </w:rPr>
-        <w:t>พากันส่งเสียงอุทาน</w:t>
-      </w:r>
-      <w:r>
-        <w:rPr>
-          <w:rFonts w:cs="Noto Serif Thai"/>
-          <w:sz w:val="32"/>
-          <w:szCs w:val="32"/>
-          <w:lang w:bidi="th-TH"/>
-        </w:rPr>
-        <w:t>ความตื่นตะลึง</w:t>
-      </w:r>
-      <w:r>
-        <w:rPr>
-          <w:rFonts w:cs="Noto Serif Thai"/>
-          <w:sz w:val="32"/>
-          <w:szCs w:val="32"/>
-          <w:lang w:bidi="th-TH"/>
-        </w:rPr>
-        <w:t xml:space="preserve"> โถงถ้ำใต้ติน</w:t>
-      </w:r>
-      <w:r>
-        <w:rPr>
-          <w:rFonts w:cs="Noto Serif Thai"/>
-          <w:sz w:val="32"/>
-          <w:szCs w:val="32"/>
-          <w:lang w:bidi="th-TH"/>
-        </w:rPr>
-        <w:t>แห่งนี้ช่าง</w:t>
-      </w:r>
-      <w:r>
-        <w:rPr>
-          <w:rFonts w:cs="Noto Serif Thai"/>
-          <w:sz w:val="32"/>
-          <w:szCs w:val="32"/>
-          <w:lang w:bidi="th-TH"/>
-        </w:rPr>
-        <w:t>สวยสดงดงาม หินงอกหินย้อยส่องแสง</w:t>
-      </w:r>
-      <w:r>
-        <w:rPr>
-          <w:rFonts w:cs="Noto Serif Thai"/>
-          <w:sz w:val="32"/>
-          <w:szCs w:val="32"/>
-          <w:lang w:bidi="th-TH"/>
-        </w:rPr>
-        <w:t>รัศมี</w:t>
-      </w:r>
-      <w:r>
-        <w:rPr>
-          <w:rFonts w:cs="Noto Serif Thai"/>
-          <w:sz w:val="32"/>
-          <w:szCs w:val="32"/>
-          <w:lang w:bidi="th-TH"/>
-        </w:rPr>
-        <w:t xml:space="preserve">สีรุ้งระยิบระยับ </w:t>
-      </w:r>
-      <w:r>
-        <w:rPr>
-          <w:rFonts w:cs="Noto Serif Thai"/>
-          <w:sz w:val="32"/>
-          <w:szCs w:val="32"/>
-          <w:lang w:bidi="th-TH"/>
-        </w:rPr>
-        <w:t>ประกายแสงกระทบบนใบหน้าของเหล่าหนุ่มสาว ดูประกายสว่างไสวเจิดจ้าดั่งสายรุ้ง</w:t>
+        <w:t>หนุ่มสาว</w:t>
+      </w:r>
+      <w:r>
+        <w:rPr>
+          <w:rFonts w:cs="Noto Serif Thai"/>
+          <w:sz w:val="32"/>
+          <w:szCs w:val="32"/>
+          <w:lang w:bidi="th-TH"/>
+        </w:rPr>
+        <w:t>ต่างพากันส่งเสียงอุทานความตื่นตะลึง โถงถ้ำใต้</w:t>
+      </w:r>
+      <w:r>
+        <w:rPr>
+          <w:rFonts w:cs="Noto Serif Thai"/>
+          <w:sz w:val="32"/>
+          <w:szCs w:val="32"/>
+          <w:lang w:bidi="th-TH"/>
+        </w:rPr>
+        <w:t>ดิ</w:t>
+      </w:r>
+      <w:r>
+        <w:rPr>
+          <w:rFonts w:cs="Noto Serif Thai"/>
+          <w:sz w:val="32"/>
+          <w:szCs w:val="32"/>
+          <w:lang w:bidi="th-TH"/>
+        </w:rPr>
+        <w:t>นแห่งนี้ช่างสวยสดงดงาม หินงอกหินย้อยส่องแสงรัศมีสีรุ้งระยิบระยับ ประกายแสงกระทบบนใบหน้าของเหล่าหนุ่มสาว ดูประกายสว่างไสวเจิดจ้าดั่งสายรุ้ง</w:t>
       </w:r>
     </w:p>
     <w:p>
@@ -18461,34 +18380,7 @@
           <w:szCs w:val="32"/>
           <w:lang w:bidi="th-TH"/>
         </w:rPr>
-        <w:t>พอเดิน</w:t>
-      </w:r>
-      <w:r>
-        <w:rPr>
-          <w:rFonts w:cs="Noto Serif Thai"/>
-          <w:sz w:val="32"/>
-          <w:szCs w:val="32"/>
-          <w:lang w:bidi="th-TH"/>
-        </w:rPr>
-        <w:t xml:space="preserve">เลี้ยวตรงหัวมุม </w:t>
-      </w:r>
-      <w:r>
-        <w:rPr>
-          <w:rFonts w:cs="Noto Serif Thai"/>
-          <w:sz w:val="32"/>
-          <w:szCs w:val="32"/>
-          <w:lang w:bidi="th-TH"/>
-        </w:rPr>
-        <w:t>แม่น้ำใต้ดินกว้างสามจั้ง</w:t>
-      </w:r>
-      <w:r>
-        <w:rPr>
-          <w:rFonts w:cs="Noto Serif Thai"/>
-          <w:sz w:val="32"/>
-          <w:szCs w:val="32"/>
-          <w:lang w:bidi="th-TH"/>
-        </w:rPr>
-        <w:t>ก็ปรากฏในสายตาและต้อนรับทุกคนที่เดินเข้ามา</w:t>
+        <w:t>พอเดินเลี้ยวตรงหัวมุม แม่น้ำใต้ดินกว้างสามจั้งก็ปรากฏในสายตาและต้อนรับทุกคนที่เดินเข้ามา</w:t>
       </w:r>
     </w:p>
     <w:p>
@@ -18578,70 +18470,88 @@
           <w:szCs w:val="32"/>
           <w:lang w:bidi="th-TH"/>
         </w:rPr>
-        <w:t>แม่น้ำสายน้ำไหลออกมาจากมุมมีดของโถงถ้ำ ใต้ผิวหน้ากระจ่างใสนั้นสามารถเห็นปลาที่ว่ายไปมา พืชใต้น้ำ ทราย และหินที่ก้นแม่น้ำ</w:t>
-      </w:r>
-    </w:p>
-    <w:p>
-      <w:pPr>
-        <w:pStyle w:val="BodyText"/>
-        <w:bidi w:val="0"/>
-        <w:spacing w:lineRule="auto" w:line="288" w:before="0" w:after="0"/>
-        <w:ind w:hanging="0" w:start="0" w:end="0"/>
-        <w:rPr>
-          <w:rFonts w:cs="Noto Serif Thai"/>
-          <w:sz w:val="32"/>
-          <w:szCs w:val="32"/>
-          <w:lang w:bidi="th-TH"/>
-        </w:rPr>
-      </w:pPr>
-      <w:r>
-        <w:rPr>
-          <w:rFonts w:cs="Noto Serif Thai"/>
-          <w:sz w:val="32"/>
-          <w:szCs w:val="32"/>
-          <w:lang w:bidi="th-TH"/>
-        </w:rPr>
-      </w:r>
-    </w:p>
-    <w:p>
-      <w:pPr>
-        <w:pStyle w:val="BodyText"/>
-        <w:bidi w:val="0"/>
-        <w:spacing w:lineRule="auto" w:line="288" w:before="0" w:after="0"/>
-        <w:ind w:hanging="0" w:start="0" w:end="0"/>
-        <w:rPr>
-          <w:rFonts w:cs="Noto Serif Thai"/>
-          <w:sz w:val="32"/>
-          <w:szCs w:val="32"/>
-          <w:lang w:bidi="th-TH"/>
-        </w:rPr>
-      </w:pPr>
-      <w:r>
-        <w:rPr>
-          <w:rFonts w:cs="Noto Serif Thai"/>
-          <w:sz w:val="32"/>
-          <w:szCs w:val="32"/>
-          <w:lang w:bidi="th-TH"/>
-        </w:rPr>
-        <w:t>อีกฝ</w:t>
-      </w:r>
-      <w:r>
-        <w:rPr>
-          <w:rFonts w:cs="Noto Serif Thai"/>
-          <w:sz w:val="32"/>
-          <w:szCs w:val="32"/>
-          <w:lang w:bidi="th-TH"/>
-        </w:rPr>
-        <w:t>าก</w:t>
-      </w:r>
-      <w:r>
-        <w:rPr>
-          <w:rFonts w:cs="Noto Serif Thai"/>
-          <w:sz w:val="32"/>
-          <w:szCs w:val="32"/>
-          <w:lang w:bidi="th-TH"/>
-        </w:rPr>
-        <w:t>หนึ่งของแม่น้ำสายนี้คือทะเลดอกไม้</w:t>
+        <w:t>แม่น้ำ</w:t>
+      </w:r>
+      <w:r>
+        <w:rPr>
+          <w:rFonts w:cs="Noto Serif Thai"/>
+          <w:sz w:val="32"/>
+          <w:szCs w:val="32"/>
+          <w:lang w:bidi="th-TH"/>
+        </w:rPr>
+        <w:t>สายนี้</w:t>
+      </w:r>
+      <w:r>
+        <w:rPr>
+          <w:rFonts w:cs="Noto Serif Thai"/>
+          <w:sz w:val="32"/>
+          <w:szCs w:val="32"/>
+          <w:lang w:bidi="th-TH"/>
+        </w:rPr>
+        <w:t>ไหลออกมาจากมุมม</w:t>
+      </w:r>
+      <w:r>
+        <w:rPr>
+          <w:rFonts w:cs="Noto Serif Thai"/>
+          <w:sz w:val="32"/>
+          <w:szCs w:val="32"/>
+          <w:lang w:bidi="th-TH"/>
+        </w:rPr>
+        <w:t>ื</w:t>
+      </w:r>
+      <w:r>
+        <w:rPr>
+          <w:rFonts w:cs="Noto Serif Thai"/>
+          <w:sz w:val="32"/>
+          <w:szCs w:val="32"/>
+          <w:lang w:bidi="th-TH"/>
+        </w:rPr>
+        <w:t>ดของโถงถ้ำ ใต้ผิวหน้ากระจ่างใสนั้นสามารถเห็นปลาที่ว่ายไปมา พืชใต้น้ำ ทราย และหินที่ก้นแม่น้ำ</w:t>
+      </w:r>
+    </w:p>
+    <w:p>
+      <w:pPr>
+        <w:pStyle w:val="BodyText"/>
+        <w:bidi w:val="0"/>
+        <w:spacing w:lineRule="auto" w:line="288" w:before="0" w:after="0"/>
+        <w:ind w:hanging="0" w:start="0" w:end="0"/>
+        <w:rPr>
+          <w:rFonts w:cs="Noto Serif Thai"/>
+          <w:sz w:val="32"/>
+          <w:szCs w:val="32"/>
+          <w:lang w:bidi="th-TH"/>
+        </w:rPr>
+      </w:pPr>
+      <w:r>
+        <w:rPr>
+          <w:rFonts w:cs="Noto Serif Thai"/>
+          <w:sz w:val="32"/>
+          <w:szCs w:val="32"/>
+          <w:lang w:bidi="th-TH"/>
+        </w:rPr>
+      </w:r>
+    </w:p>
+    <w:p>
+      <w:pPr>
+        <w:pStyle w:val="BodyText"/>
+        <w:bidi w:val="0"/>
+        <w:spacing w:lineRule="auto" w:line="288" w:before="0" w:after="0"/>
+        <w:ind w:hanging="0" w:start="0" w:end="0"/>
+        <w:rPr>
+          <w:rFonts w:cs="Noto Serif Thai"/>
+          <w:sz w:val="32"/>
+          <w:szCs w:val="32"/>
+          <w:lang w:bidi="th-TH"/>
+        </w:rPr>
+      </w:pPr>
+      <w:r>
+        <w:rPr>
+          <w:rFonts w:cs="Noto Serif Thai"/>
+          <w:sz w:val="32"/>
+          <w:szCs w:val="32"/>
+          <w:lang w:bidi="th-TH"/>
+        </w:rPr>
+        <w:t>อีกฝากหนึ่งของแม่น้ำสายนี้คือทะเลดอกไม้</w:t>
       </w:r>
     </w:p>
     <w:p>
@@ -18731,25 +18641,7 @@
           <w:szCs w:val="32"/>
           <w:lang w:bidi="th-TH"/>
         </w:rPr>
-        <w:t>เมื่อมองดูเพียงแวบแรก ท่ามกลางฉากหลังอันมืดมิด ทะเลบุปผาริมฝั่งแม่น้ำ</w:t>
-      </w:r>
-      <w:r>
-        <w:rPr>
-          <w:rFonts w:cs="Noto Serif Thai"/>
-          <w:sz w:val="32"/>
-          <w:szCs w:val="32"/>
-          <w:lang w:bidi="th-TH"/>
-        </w:rPr>
-        <w:t>ดูราวกับเป็น</w:t>
-      </w:r>
-      <w:r>
-        <w:rPr>
-          <w:rFonts w:cs="Noto Serif Thai"/>
-          <w:sz w:val="32"/>
-          <w:szCs w:val="32"/>
-          <w:lang w:bidi="th-TH"/>
-        </w:rPr>
-        <w:t>พรมสีเขียวผืนมหึมาที่ถูกประดับประดาด้วยไข่มุกนับไม่ถ้วน</w:t>
+        <w:t>เมื่อมองดูเพียงแวบแรก ท่ามกลางฉากหลังอันมืดมิด ทะเลบุปผาริมฝั่งแม่น้ำดูราวกับเป็นพรมสีเขียวผืนมหึมาที่ถูกประดับประดาด้วยไข่มุกนับไม่ถ้วน</w:t>
       </w:r>
     </w:p>
     <w:p>
@@ -18803,16 +18695,7 @@
           <w:szCs w:val="32"/>
           <w:lang w:bidi="th-TH"/>
         </w:rPr>
-        <w:t xml:space="preserve">ดอกกล้วยไม้จันทราถือเป็นอาหารสำหรับกู่จำนวนมาก ทะเลดอกไม้แห่งนี้นับว่าเป็นรากฐานสำหรับการฝึกฝนที่สำคัญที่สุดของตระกูล” </w:t>
-      </w:r>
-      <w:r>
-        <w:rPr>
-          <w:rFonts w:cs="Noto Serif Thai"/>
-          <w:sz w:val="32"/>
-          <w:szCs w:val="32"/>
-          <w:lang w:bidi="th-TH"/>
-        </w:rPr>
-        <w:t>ฟางหยวนคิดในใจอย่างรู้ดี</w:t>
+        <w:t>ดอกกล้วยไม้จันทราถือเป็นอาหารสำหรับกู่จำนวนมาก ทะเลดอกไม้แห่งนี้นับว่าเป็นรากฐานสำหรับการฝึกฝนที่สำคัญที่สุดของตระกูล” ฟางหยวนคิดในใจอย่างรู้ดี</w:t>
       </w:r>
     </w:p>
     <w:p>
@@ -19037,7 +18920,7 @@
           <w:szCs w:val="32"/>
           <w:lang w:bidi="th-TH"/>
         </w:rPr>
-        <w:t>เอาล่ะ ฟังข้าขานชื่อพวกเจ้าแต่ละคนให้ดี ผู้ถูกถูกขานชื่อต้องเดินข้ามแม่น้ำสายนี้ไปอีกฝั่ง เดินให้ไกลสุดเท่าที่จะทำได้ ยิ่งไกลยิ่งดี ชัดเจนหรือไม่</w:t>
+        <w:t>เอาล่ะ ฟังข้าขานชื่อพวกเจ้าแต่ละคนให้ดี ผู้ถูกขานชื่อต้องเดินข้ามแม่น้ำสายนี้ไปอีกฝั่ง เดินให้ไกลสุดเท่าที่จะทำได้ ยิ่งไกลยิ่งดี ชัดเจนหรือไม่</w:t>
       </w:r>
       <w:r>
         <w:rPr>
@@ -19181,79 +19064,52 @@
           <w:szCs w:val="32"/>
           <w:lang w:bidi="th-TH"/>
         </w:rPr>
-        <w:t xml:space="preserve">กู่เยว่เฉินป๋อ” </w:t>
-      </w:r>
-      <w:r>
-        <w:rPr>
-          <w:rFonts w:cs="Noto Serif Thai"/>
-          <w:sz w:val="32"/>
-          <w:szCs w:val="32"/>
-          <w:lang w:bidi="th-TH"/>
-        </w:rPr>
-        <w:t>ผู้อาวุโสขานชื่อเพื่อเรียกบุคคลแรกที่จะได้เดินข้ามแม่น้ำ</w:t>
-      </w:r>
-    </w:p>
-    <w:p>
-      <w:pPr>
-        <w:pStyle w:val="BodyText"/>
-        <w:bidi w:val="0"/>
-        <w:spacing w:lineRule="auto" w:line="288" w:before="0" w:after="0"/>
-        <w:ind w:hanging="0" w:start="0" w:end="0"/>
-        <w:rPr>
-          <w:rFonts w:cs="Noto Serif Thai"/>
-          <w:sz w:val="32"/>
-          <w:szCs w:val="32"/>
-          <w:lang w:bidi="th-TH"/>
-        </w:rPr>
-      </w:pPr>
-      <w:r>
-        <w:rPr>
-          <w:rFonts w:cs="Noto Serif Thai"/>
-          <w:sz w:val="32"/>
-          <w:szCs w:val="32"/>
-          <w:lang w:bidi="th-TH"/>
-        </w:rPr>
-      </w:r>
-    </w:p>
-    <w:p>
-      <w:pPr>
-        <w:pStyle w:val="BodyText"/>
-        <w:bidi w:val="0"/>
-        <w:spacing w:lineRule="auto" w:line="288" w:before="0" w:after="0"/>
-        <w:ind w:hanging="0" w:start="0" w:end="0"/>
-        <w:rPr>
-          <w:rFonts w:cs="Noto Serif Thai"/>
-          <w:sz w:val="32"/>
-          <w:szCs w:val="32"/>
-          <w:lang w:bidi="th-TH"/>
-        </w:rPr>
-      </w:pPr>
-      <w:r>
-        <w:rPr>
-          <w:rFonts w:cs="Noto Serif Thai"/>
-          <w:sz w:val="32"/>
-          <w:szCs w:val="32"/>
-          <w:lang w:bidi="th-TH"/>
-        </w:rPr>
-        <w:t>แม่น้ำ</w:t>
-      </w:r>
-      <w:r>
-        <w:rPr>
-          <w:rFonts w:cs="Noto Serif Thai"/>
-          <w:sz w:val="32"/>
-          <w:szCs w:val="32"/>
-          <w:lang w:bidi="th-TH"/>
-        </w:rPr>
-        <w:t>นี้</w:t>
-      </w:r>
-      <w:r>
-        <w:rPr>
-          <w:rFonts w:cs="Noto Serif Thai"/>
-          <w:sz w:val="32"/>
-          <w:szCs w:val="32"/>
-          <w:lang w:bidi="th-TH"/>
-        </w:rPr>
-        <w:t>กว้างแต่ไม่ลึก มากสุดก็สูงถึงเพียงแค่เข่าหนุ่มสาวเท่านั้น ใบหน้าของเฉินป๋อแสดงความจริงจังอย่างเต็มเปี่ยมเมื่อเขาก้าวลงใบยังแม่น้ำริมทะเลดอกไม้</w:t>
+        <w:t>กู่เยว่เฉินป๋อ” ผู้อาวุโสขานชื่อเพื่อเรียกบุคคลแรกที่จะได้เดินข้ามแม่น้ำ</w:t>
+      </w:r>
+    </w:p>
+    <w:p>
+      <w:pPr>
+        <w:pStyle w:val="BodyText"/>
+        <w:bidi w:val="0"/>
+        <w:spacing w:lineRule="auto" w:line="288" w:before="0" w:after="0"/>
+        <w:ind w:hanging="0" w:start="0" w:end="0"/>
+        <w:rPr>
+          <w:rFonts w:cs="Noto Serif Thai"/>
+          <w:sz w:val="32"/>
+          <w:szCs w:val="32"/>
+          <w:lang w:bidi="th-TH"/>
+        </w:rPr>
+      </w:pPr>
+      <w:r>
+        <w:rPr>
+          <w:rFonts w:cs="Noto Serif Thai"/>
+          <w:sz w:val="32"/>
+          <w:szCs w:val="32"/>
+          <w:lang w:bidi="th-TH"/>
+        </w:rPr>
+      </w:r>
+    </w:p>
+    <w:p>
+      <w:pPr>
+        <w:pStyle w:val="BodyText"/>
+        <w:bidi w:val="0"/>
+        <w:spacing w:lineRule="auto" w:line="288" w:before="0" w:after="0"/>
+        <w:ind w:hanging="0" w:start="0" w:end="0"/>
+        <w:rPr>
+          <w:rFonts w:cs="Noto Serif Thai"/>
+          <w:sz w:val="32"/>
+          <w:szCs w:val="32"/>
+          <w:lang w:bidi="th-TH"/>
+        </w:rPr>
+      </w:pPr>
+      <w:r>
+        <w:rPr>
+          <w:rFonts w:cs="Noto Serif Thai"/>
+          <w:sz w:val="32"/>
+          <w:szCs w:val="32"/>
+          <w:lang w:bidi="th-TH"/>
+        </w:rPr>
+        <w:t>แม่น้ำนี้กว้างแต่ไม่ลึก มากสุดก็สูงถึงเพียงแค่เข่าหนุ่มสาวเท่านั้น ใบหน้าของเฉินป๋อแสดงความจริงจังอย่างเต็มเปี่ยมเมื่อเขาก้าวลงใบยังแม่น้ำริมทะเลดอกไม้</w:t>
       </w:r>
     </w:p>
     <w:p>
@@ -19343,7 +19199,106 @@
           <w:szCs w:val="32"/>
           <w:lang w:bidi="th-TH"/>
         </w:rPr>
-        <w:t>แสงเหล่านั้นก่อตัวรอบเฉินป๋อก่อนจะซึมเข้าไปในร่างของเขา ในชั่วขณะนั้นเอง เฉินป๋อรู้สึกราวกับว่ากำแพงที่มองไม่เห็นนั้นอ่อนลง เมื่อนั้นแล้วเฉินป๋อจึงกัดฟันแล้วเค้นแรงในร่างเพื่อเดินหน้าต่อไป แม้เขาพยายามเดินต่อไปอย่างยากลำบาก แต่เพียงแค่สามก้าวถัดไปเขาก็เดินไปต่อไม่ได้แล้ว เป็นเพราะกำแพงตรงหน้าของเขากลับมาแข็งเหมือนในตอนแรก</w:t>
+        <w:t xml:space="preserve">แสงเหล่านั้นก่อตัวรอบเฉินป๋อก่อนจะซึมเข้าไปในร่างของเขา ในชั่วขณะนั้นเอง </w:t>
+      </w:r>
+      <w:r>
+        <w:rPr>
+          <w:rFonts w:cs="Noto Serif Thai"/>
+          <w:sz w:val="32"/>
+          <w:szCs w:val="32"/>
+          <w:lang w:bidi="th-TH"/>
+        </w:rPr>
+        <w:t>เขา</w:t>
+      </w:r>
+      <w:r>
+        <w:rPr>
+          <w:rFonts w:cs="Noto Serif Thai"/>
+          <w:sz w:val="32"/>
+          <w:szCs w:val="32"/>
+          <w:lang w:bidi="th-TH"/>
+        </w:rPr>
+        <w:t xml:space="preserve">รู้สึกราวกับว่ากำแพงที่มองไม่เห็นนั้นอ่อนลง เฉินป๋อจึงกัดฟัน เค้นแรงในร่างเพื่อเดินหน้าต่อไป </w:t>
+      </w:r>
+      <w:r>
+        <w:rPr>
+          <w:rFonts w:cs="Noto Serif Thai"/>
+          <w:sz w:val="32"/>
+          <w:szCs w:val="32"/>
+          <w:lang w:bidi="th-TH"/>
+        </w:rPr>
+        <w:t>แต่เมื่อ</w:t>
+      </w:r>
+      <w:r>
+        <w:rPr>
+          <w:rFonts w:cs="Noto Serif Thai"/>
+          <w:sz w:val="32"/>
+          <w:szCs w:val="32"/>
+          <w:lang w:bidi="th-TH"/>
+        </w:rPr>
+        <w:t>เขาพยายามเดิน</w:t>
+      </w:r>
+      <w:r>
+        <w:rPr>
+          <w:rFonts w:cs="Noto Serif Thai"/>
+          <w:sz w:val="32"/>
+          <w:szCs w:val="32"/>
+          <w:lang w:bidi="th-TH"/>
+        </w:rPr>
+        <w:t>หน้าไปต่อ</w:t>
+      </w:r>
+      <w:r>
+        <w:rPr>
+          <w:rFonts w:cs="Noto Serif Thai"/>
+          <w:sz w:val="32"/>
+          <w:szCs w:val="32"/>
+          <w:lang w:bidi="th-TH"/>
+        </w:rPr>
+        <w:t>อย่างยากลำบาก เพียงแค่สามก้าวถัดไปเขาก็เดินไปต่อไม่ไ</w:t>
+      </w:r>
+      <w:r>
+        <w:rPr>
+          <w:rFonts w:cs="Noto Serif Thai"/>
+          <w:sz w:val="32"/>
+          <w:szCs w:val="32"/>
+          <w:lang w:bidi="th-TH"/>
+        </w:rPr>
+        <w:t>หว</w:t>
+      </w:r>
+      <w:r>
+        <w:rPr>
+          <w:rFonts w:cs="Noto Serif Thai"/>
+          <w:sz w:val="32"/>
+          <w:szCs w:val="32"/>
+          <w:lang w:bidi="th-TH"/>
+        </w:rPr>
+        <w:t xml:space="preserve">แล้ว </w:t>
+      </w:r>
+      <w:r>
+        <w:rPr>
+          <w:rFonts w:cs="Noto Serif Thai"/>
+          <w:sz w:val="32"/>
+          <w:szCs w:val="32"/>
+          <w:lang w:bidi="th-TH"/>
+        </w:rPr>
+        <w:t>นั่น</w:t>
+      </w:r>
+      <w:r>
+        <w:rPr>
+          <w:rFonts w:cs="Noto Serif Thai"/>
+          <w:sz w:val="32"/>
+          <w:szCs w:val="32"/>
+          <w:lang w:bidi="th-TH"/>
+        </w:rPr>
+        <w:t>เป็นเพราะกำแพงตรงหน้าของเขากลับมาแข็งเหมือน</w:t>
+      </w:r>
+      <w:r>
+        <w:rPr>
+          <w:rFonts w:cs="Noto Serif Thai"/>
+          <w:sz w:val="32"/>
+          <w:szCs w:val="32"/>
+          <w:lang w:bidi="th-TH"/>
+        </w:rPr>
+        <w:t>ตอนแรกเริ่ม</w:t>
       </w:r>
     </w:p>
     <w:p>
@@ -19390,27 +19345,2296 @@
         </w:rPr>
         <w:t>เมื่อเห็นเช่นนั้น ผู้อาวุโสก</w:t>
       </w:r>
-    </w:p>
-    <w:p>
-      <w:pPr>
-        <w:pStyle w:val="BodyText"/>
-        <w:bidi w:val="0"/>
-        <w:spacing w:lineRule="auto" w:line="288" w:before="0" w:after="0"/>
-        <w:ind w:hanging="0" w:start="0" w:end="0"/>
-        <w:rPr>
-          <w:rFonts w:cs="Noto Serif Thai"/>
-          <w:sz w:val="32"/>
-          <w:szCs w:val="32"/>
-          <w:lang w:bidi="th-TH"/>
-        </w:rPr>
-      </w:pPr>
-      <w:r>
-        <w:rPr>
-          <w:rFonts w:cs="Noto Serif Thai"/>
-          <w:sz w:val="32"/>
-          <w:szCs w:val="32"/>
-          <w:lang w:bidi="th-TH"/>
-        </w:rPr>
+      <w:r>
+        <w:rPr>
+          <w:rFonts w:cs="Noto Serif Thai"/>
+          <w:sz w:val="32"/>
+          <w:szCs w:val="32"/>
+          <w:lang w:bidi="th-TH"/>
+        </w:rPr>
+        <w:t>็ทอดถอนหายใจแล้วบันทึกผลลัพธ์ หลังจากนั้นเขากล่าวว่า “กู่เยว่เฉินป๋อ สามก้าว ไร้พรสวรรค์จะเป็นปรมาจารย์กู่</w:t>
+      </w:r>
+      <w:r>
+        <w:rPr>
+          <w:rFonts w:cs="Noto Serif Thai"/>
+          <w:sz w:val="32"/>
+          <w:szCs w:val="32"/>
+          <w:lang w:bidi="th-TH"/>
+        </w:rPr>
+        <w:t xml:space="preserve">... </w:t>
+      </w:r>
+      <w:r>
+        <w:rPr>
+          <w:rFonts w:cs="Noto Serif Thai"/>
+          <w:sz w:val="32"/>
+          <w:szCs w:val="32"/>
+          <w:lang w:bidi="th-TH"/>
+        </w:rPr>
+        <w:t>คนถัดไป กู่เยว่เจ่าเซี่ย</w:t>
+      </w:r>
+      <w:r>
+        <w:rPr>
+          <w:rFonts w:cs="Noto Serif Thai"/>
+          <w:sz w:val="32"/>
+          <w:szCs w:val="32"/>
+          <w:lang w:bidi="th-TH"/>
+        </w:rPr>
+        <w:t>!”</w:t>
+      </w:r>
+    </w:p>
+    <w:p>
+      <w:pPr>
+        <w:pStyle w:val="BodyText"/>
+        <w:bidi w:val="0"/>
+        <w:spacing w:lineRule="auto" w:line="288" w:before="0" w:after="0"/>
+        <w:ind w:hanging="0" w:start="0" w:end="0"/>
+        <w:rPr>
+          <w:rFonts w:cs="Noto Serif Thai"/>
+          <w:sz w:val="32"/>
+          <w:szCs w:val="32"/>
+          <w:lang w:bidi="th-TH"/>
+        </w:rPr>
+      </w:pPr>
+      <w:r>
+        <w:rPr>
+          <w:rFonts w:cs="Noto Serif Thai"/>
+          <w:sz w:val="32"/>
+          <w:szCs w:val="32"/>
+          <w:lang w:bidi="th-TH"/>
+        </w:rPr>
+      </w:r>
+    </w:p>
+    <w:p>
+      <w:pPr>
+        <w:pStyle w:val="BodyText"/>
+        <w:bidi w:val="0"/>
+        <w:spacing w:lineRule="auto" w:line="288" w:before="0" w:after="0"/>
+        <w:ind w:hanging="0" w:start="0" w:end="0"/>
+        <w:rPr>
+          <w:rFonts w:cs="Noto Serif Thai"/>
+          <w:sz w:val="32"/>
+          <w:szCs w:val="32"/>
+          <w:lang w:bidi="th-TH"/>
+        </w:rPr>
+      </w:pPr>
+      <w:r>
+        <w:rPr>
+          <w:rFonts w:cs="Noto Serif Thai"/>
+          <w:sz w:val="32"/>
+          <w:szCs w:val="32"/>
+          <w:lang w:bidi="th-TH"/>
+        </w:rPr>
+        <w:t>ใบหน้าของเฉินป๋อซีดเผือด เขากัดฟันเดินข้ามฝั่งกลับไปรวมกับหนุ่มสาวคนอื่นๆ เมื่อไร้พรสวรรค์ เขาก็สามารถใช้ชีวิตเช่นคนธรรมดาในลำดับชั้นต่ำสุดของตระกูล</w:t>
+      </w:r>
+    </w:p>
+    <w:p>
+      <w:pPr>
+        <w:pStyle w:val="BodyText"/>
+        <w:bidi w:val="0"/>
+        <w:spacing w:lineRule="auto" w:line="288" w:before="0" w:after="0"/>
+        <w:ind w:hanging="0" w:start="0" w:end="0"/>
+        <w:rPr>
+          <w:rFonts w:cs="Noto Serif Thai"/>
+          <w:sz w:val="32"/>
+          <w:szCs w:val="32"/>
+          <w:lang w:bidi="th-TH"/>
+        </w:rPr>
+      </w:pPr>
+      <w:r>
+        <w:rPr>
+          <w:rFonts w:cs="Noto Serif Thai"/>
+          <w:sz w:val="32"/>
+          <w:szCs w:val="32"/>
+          <w:lang w:bidi="th-TH"/>
+        </w:rPr>
+      </w:r>
+    </w:p>
+    <w:p>
+      <w:pPr>
+        <w:pStyle w:val="BodyText"/>
+        <w:bidi w:val="0"/>
+        <w:spacing w:lineRule="auto" w:line="288" w:before="0" w:after="0"/>
+        <w:ind w:hanging="0" w:start="0" w:end="0"/>
+        <w:rPr>
+          <w:rFonts w:cs="Noto Serif Thai"/>
+          <w:sz w:val="32"/>
+          <w:szCs w:val="32"/>
+          <w:lang w:bidi="th-TH"/>
+        </w:rPr>
+      </w:pPr>
+      <w:r>
+        <w:rPr>
+          <w:rFonts w:cs="Noto Serif Thai"/>
+          <w:sz w:val="32"/>
+          <w:szCs w:val="32"/>
+          <w:lang w:bidi="th-TH"/>
+        </w:rPr>
+        <w:t>ตัวเขาสั่นคลอน เหตุการณ์เมื่อครู่ส่งผลกระทบรุนแรงเสมือนความเป็นจริงได้สังหารความหวังทั้งหมดของเขาจนสิ้น ผู้คนมากมายส่งสายตาเห็นใจให้เฉินป๋อ แต่ขณะเดียวกัน ผู้คนมากมายก็ยิ่งจ้องมองไปยังบุคคลที่สองที่จะได้ข้ามแม่น้ำ</w:t>
+      </w:r>
+    </w:p>
+    <w:p>
+      <w:pPr>
+        <w:pStyle w:val="BodyText"/>
+        <w:bidi w:val="0"/>
+        <w:spacing w:lineRule="auto" w:line="288" w:before="0" w:after="0"/>
+        <w:ind w:hanging="0" w:start="0" w:end="0"/>
+        <w:rPr>
+          <w:rFonts w:cs="Noto Serif Thai"/>
+          <w:sz w:val="32"/>
+          <w:szCs w:val="32"/>
+          <w:lang w:bidi="th-TH"/>
+        </w:rPr>
+      </w:pPr>
+      <w:r>
+        <w:rPr>
+          <w:rFonts w:cs="Noto Serif Thai"/>
+          <w:sz w:val="32"/>
+          <w:szCs w:val="32"/>
+          <w:lang w:bidi="th-TH"/>
+        </w:rPr>
+      </w:r>
+    </w:p>
+    <w:p>
+      <w:pPr>
+        <w:pStyle w:val="BodyText"/>
+        <w:bidi w:val="0"/>
+        <w:spacing w:lineRule="auto" w:line="288" w:before="0" w:after="0"/>
+        <w:ind w:hanging="0" w:start="0" w:end="0"/>
+        <w:rPr>
+          <w:rFonts w:cs="Noto Serif Thai"/>
+          <w:sz w:val="32"/>
+          <w:szCs w:val="32"/>
+          <w:lang w:bidi="th-TH"/>
+        </w:rPr>
+      </w:pPr>
+      <w:r>
+        <w:rPr>
+          <w:rFonts w:cs="Noto Serif Thai"/>
+          <w:sz w:val="32"/>
+          <w:szCs w:val="32"/>
+          <w:lang w:bidi="th-TH"/>
+        </w:rPr>
+        <w:t>ช่างน่าเศร้า แต่เด็กคนถัดไปเดินไปได้เพียงสี่ก้าว เขาไร้พรสวรรค์เช่นเดียวกัน</w:t>
+      </w:r>
+    </w:p>
+    <w:p>
+      <w:pPr>
+        <w:pStyle w:val="BodyText"/>
+        <w:bidi w:val="0"/>
+        <w:spacing w:lineRule="auto" w:line="288" w:before="0" w:after="0"/>
+        <w:ind w:hanging="0" w:start="0" w:end="0"/>
+        <w:rPr>
+          <w:rFonts w:cs="Noto Serif Thai"/>
+          <w:sz w:val="32"/>
+          <w:szCs w:val="32"/>
+          <w:lang w:bidi="th-TH"/>
+        </w:rPr>
+      </w:pPr>
+      <w:r>
+        <w:rPr>
+          <w:rFonts w:cs="Noto Serif Thai"/>
+          <w:sz w:val="32"/>
+          <w:szCs w:val="32"/>
+          <w:lang w:bidi="th-TH"/>
+        </w:rPr>
+      </w:r>
+    </w:p>
+    <w:p>
+      <w:pPr>
+        <w:pStyle w:val="BodyText"/>
+        <w:bidi w:val="0"/>
+        <w:spacing w:lineRule="auto" w:line="288" w:before="0" w:after="0"/>
+        <w:ind w:hanging="0" w:start="0" w:end="0"/>
+        <w:rPr>
+          <w:rFonts w:cs="Noto Serif Thai"/>
+          <w:sz w:val="32"/>
+          <w:szCs w:val="32"/>
+          <w:lang w:bidi="th-TH"/>
+        </w:rPr>
+      </w:pPr>
+      <w:r>
+        <w:rPr>
+          <w:rFonts w:cs="Noto Serif Thai"/>
+          <w:sz w:val="32"/>
+          <w:szCs w:val="32"/>
+          <w:lang w:bidi="th-TH"/>
+        </w:rPr>
+        <w:t>ไม่ใช่ทุกคนที่จะมีพรสวรรค์ในการเป็นปรมาจารย์กู่แต่กำเนิด เมื่อว่ากันตามความเป็นจริงแล้วนั้น การที่มีผู้มีพรสวรรค์ห้าจากสิบคนนั้นก็ถือว่าเป็นเรื่องที่ไม่ได้แย่เลย</w:t>
+      </w:r>
+    </w:p>
+    <w:p>
+      <w:pPr>
+        <w:pStyle w:val="BodyText"/>
+        <w:bidi w:val="0"/>
+        <w:spacing w:lineRule="auto" w:line="288" w:before="0" w:after="0"/>
+        <w:ind w:hanging="0" w:start="0" w:end="0"/>
+        <w:rPr>
+          <w:rFonts w:cs="Noto Serif Thai"/>
+          <w:sz w:val="32"/>
+          <w:szCs w:val="32"/>
+          <w:lang w:bidi="th-TH"/>
+        </w:rPr>
+      </w:pPr>
+      <w:r>
+        <w:rPr>
+          <w:rFonts w:cs="Noto Serif Thai"/>
+          <w:sz w:val="32"/>
+          <w:szCs w:val="32"/>
+          <w:lang w:bidi="th-TH"/>
+        </w:rPr>
+      </w:r>
+    </w:p>
+    <w:p>
+      <w:pPr>
+        <w:pStyle w:val="BodyText"/>
+        <w:bidi w:val="0"/>
+        <w:spacing w:lineRule="auto" w:line="288" w:before="0" w:after="0"/>
+        <w:ind w:hanging="0" w:start="0" w:end="0"/>
+        <w:rPr>
+          <w:rFonts w:cs="Noto Serif Thai"/>
+          <w:sz w:val="32"/>
+          <w:szCs w:val="32"/>
+          <w:lang w:bidi="th-TH"/>
+        </w:rPr>
+      </w:pPr>
+      <w:r>
+        <w:rPr>
+          <w:rFonts w:cs="Noto Serif Thai"/>
+          <w:sz w:val="32"/>
+          <w:szCs w:val="32"/>
+          <w:lang w:bidi="th-TH"/>
+        </w:rPr>
+        <w:t>สำหรับตระกูลกู่เยว่ อัตราส่วนนี้มีค่าสูงถึงหกในสิบคน นั่นเป็นเพราะ</w:t>
+      </w:r>
+      <w:r>
+        <w:rPr>
+          <w:rFonts w:cs="Noto Serif Thai"/>
+          <w:sz w:val="32"/>
+          <w:szCs w:val="32"/>
+          <w:lang w:bidi="th-TH"/>
+        </w:rPr>
+        <w:t>ผู้นำตระกูลรุ่นแรก เขาเป็นบุรุษที่แข็งแกร่งและโด่งดังจนเป็นตำนาน ผนวกเข้ากับเหตุผลทางการบ่มเพาะพลัง สายเลือดของเขาจึงมีพันธุกรรมแข็งแกร่ง ฉะนั้นแล้วค่าเฉลี่ยพรสวรรค์ในตระกูลกู่เยว่จึงสูงกว่าทั่วไป เพราะลูกหลานมีสายเลือดของเขาไหลเวียนอยู่</w:t>
+      </w:r>
+    </w:p>
+    <w:p>
+      <w:pPr>
+        <w:pStyle w:val="BodyText"/>
+        <w:bidi w:val="0"/>
+        <w:spacing w:lineRule="auto" w:line="288" w:before="0" w:after="0"/>
+        <w:ind w:hanging="0" w:start="0" w:end="0"/>
+        <w:rPr>
+          <w:rFonts w:cs="Noto Serif Thai"/>
+          <w:sz w:val="32"/>
+          <w:szCs w:val="32"/>
+          <w:lang w:bidi="th-TH"/>
+        </w:rPr>
+      </w:pPr>
+      <w:r>
+        <w:rPr>
+          <w:rFonts w:cs="Noto Serif Thai"/>
+          <w:sz w:val="32"/>
+          <w:szCs w:val="32"/>
+          <w:lang w:bidi="th-TH"/>
+        </w:rPr>
+      </w:r>
+    </w:p>
+    <w:p>
+      <w:pPr>
+        <w:pStyle w:val="BodyText"/>
+        <w:bidi w:val="0"/>
+        <w:spacing w:lineRule="auto" w:line="288" w:before="0" w:after="0"/>
+        <w:ind w:hanging="0" w:start="0" w:end="0"/>
+        <w:rPr>
+          <w:rFonts w:cs="Noto Serif Thai"/>
+          <w:sz w:val="32"/>
+          <w:szCs w:val="32"/>
+          <w:lang w:bidi="th-TH"/>
+        </w:rPr>
+      </w:pPr>
+      <w:r>
+        <w:rPr>
+          <w:rFonts w:cs="Noto Serif Thai"/>
+          <w:sz w:val="32"/>
+          <w:szCs w:val="32"/>
+          <w:lang w:bidi="th-TH"/>
+        </w:rPr>
+        <w:t>หลังจากความล้มเหลวสองครั้งติดกัน ผู้อาวุโสคนอื่นๆ ที่กำลังเฝ้ามองอยู่ในความมืดก็เริ่มหน้าเสีย แม้แต่ผู้นำตระกูลก็เริ่มขมวดคิ้วเล็กน้อย</w:t>
+      </w:r>
+    </w:p>
+    <w:p>
+      <w:pPr>
+        <w:pStyle w:val="BodyText"/>
+        <w:bidi w:val="0"/>
+        <w:spacing w:lineRule="auto" w:line="288" w:before="0" w:after="0"/>
+        <w:ind w:hanging="0" w:start="0" w:end="0"/>
+        <w:rPr>
+          <w:rFonts w:cs="Noto Serif Thai"/>
+          <w:sz w:val="32"/>
+          <w:szCs w:val="32"/>
+          <w:lang w:bidi="th-TH"/>
+        </w:rPr>
+      </w:pPr>
+      <w:r>
+        <w:rPr>
+          <w:rFonts w:cs="Noto Serif Thai"/>
+          <w:sz w:val="32"/>
+          <w:szCs w:val="32"/>
+          <w:lang w:bidi="th-TH"/>
+        </w:rPr>
+      </w:r>
+    </w:p>
+    <w:p>
+      <w:pPr>
+        <w:pStyle w:val="BodyText"/>
+        <w:bidi w:val="0"/>
+        <w:spacing w:lineRule="auto" w:line="288" w:before="0" w:after="0"/>
+        <w:ind w:hanging="0" w:start="0" w:end="0"/>
+        <w:rPr>
+          <w:rFonts w:cs="Noto Serif Thai"/>
+          <w:sz w:val="32"/>
+          <w:szCs w:val="32"/>
+          <w:lang w:bidi="th-TH"/>
+        </w:rPr>
+      </w:pPr>
+      <w:r>
+        <w:rPr>
+          <w:rFonts w:cs="Noto Serif Thai"/>
+          <w:sz w:val="32"/>
+          <w:szCs w:val="32"/>
+          <w:lang w:bidi="th-TH"/>
+        </w:rPr>
+        <w:t>ในจังหวะต่อมา ผู้อาวุโสจากสถานบันของตระกูลขานชื่อที่สามออกมา กู่เยว่โม่เป่ย</w:t>
+      </w:r>
+    </w:p>
+    <w:p>
+      <w:pPr>
+        <w:pStyle w:val="BodyText"/>
+        <w:bidi w:val="0"/>
+        <w:spacing w:lineRule="auto" w:line="288" w:before="0" w:after="0"/>
+        <w:ind w:hanging="0" w:start="0" w:end="0"/>
+        <w:rPr>
+          <w:rFonts w:cs="Noto Serif Thai"/>
+          <w:sz w:val="32"/>
+          <w:szCs w:val="32"/>
+          <w:lang w:bidi="th-TH"/>
+        </w:rPr>
+      </w:pPr>
+      <w:r>
+        <w:rPr>
+          <w:rFonts w:cs="Noto Serif Thai"/>
+          <w:sz w:val="32"/>
+          <w:szCs w:val="32"/>
+          <w:lang w:bidi="th-TH"/>
+        </w:rPr>
+      </w:r>
+    </w:p>
+    <w:p>
+      <w:pPr>
+        <w:pStyle w:val="BodyText"/>
+        <w:bidi w:val="0"/>
+        <w:spacing w:lineRule="auto" w:line="288" w:before="0" w:after="0"/>
+        <w:ind w:hanging="0" w:start="0" w:end="0"/>
+        <w:rPr>
+          <w:rFonts w:cs="Noto Serif Thai"/>
+          <w:sz w:val="32"/>
+          <w:szCs w:val="32"/>
+          <w:lang w:bidi="th-TH"/>
+        </w:rPr>
+      </w:pPr>
+      <w:r>
+        <w:rPr>
+          <w:rFonts w:cs="Noto Serif Thai"/>
+          <w:sz w:val="32"/>
+          <w:szCs w:val="32"/>
+          <w:lang w:bidi="th-TH"/>
+        </w:rPr>
+        <w:t>“</w:t>
+      </w:r>
+      <w:r>
+        <w:rPr>
+          <w:rFonts w:cs="Noto Serif Thai"/>
+          <w:sz w:val="32"/>
+          <w:szCs w:val="32"/>
+          <w:lang w:bidi="th-TH"/>
+        </w:rPr>
+        <w:t>ตรงนี้” ชายหนุ่มใบหน้ายาวคล้ายม้าในชุดผ้าลินินขานรับเบาๆ ขณะก้าวออกมาข้างหน้า เขามีรูปร่างสูงใหญ่และดูบึกบึนกว่าเด็กวัยเดียวกันมาก มันมีรัศมีความกล้าหาญแผ่ออกมาจากเด็กหนุ่มคนนี้</w:t>
+      </w:r>
+    </w:p>
+    <w:p>
+      <w:pPr>
+        <w:pStyle w:val="BodyText"/>
+        <w:bidi w:val="0"/>
+        <w:spacing w:lineRule="auto" w:line="288" w:before="0" w:after="0"/>
+        <w:ind w:hanging="0" w:start="0" w:end="0"/>
+        <w:rPr>
+          <w:rFonts w:cs="Noto Serif Thai"/>
+          <w:sz w:val="32"/>
+          <w:szCs w:val="32"/>
+          <w:lang w:bidi="th-TH"/>
+        </w:rPr>
+      </w:pPr>
+      <w:r>
+        <w:rPr>
+          <w:rFonts w:cs="Noto Serif Thai"/>
+          <w:sz w:val="32"/>
+          <w:szCs w:val="32"/>
+          <w:lang w:bidi="th-TH"/>
+        </w:rPr>
+      </w:r>
+    </w:p>
+    <w:p>
+      <w:pPr>
+        <w:pStyle w:val="BodyText"/>
+        <w:bidi w:val="0"/>
+        <w:spacing w:lineRule="auto" w:line="288" w:before="0" w:after="0"/>
+        <w:ind w:hanging="0" w:start="0" w:end="0"/>
+        <w:rPr>
+          <w:rFonts w:cs="Noto Serif Thai"/>
+          <w:sz w:val="32"/>
+          <w:szCs w:val="32"/>
+          <w:lang w:bidi="th-TH"/>
+        </w:rPr>
+      </w:pPr>
+      <w:r>
+        <w:rPr>
+          <w:rFonts w:cs="Noto Serif Thai"/>
+          <w:sz w:val="32"/>
+          <w:szCs w:val="32"/>
+          <w:lang w:bidi="th-TH"/>
+        </w:rPr>
+        <w:t>หลังเขาเดินข้ามแม่น้ำไปไม่กี่ก้าว เขาก็ข้ามไปอีกฝั่งหนึ่งได้ ทว่าเขายังก้าวต่อไปได้อีก</w:t>
+      </w:r>
+    </w:p>
+    <w:p>
+      <w:pPr>
+        <w:pStyle w:val="BodyText"/>
+        <w:bidi w:val="0"/>
+        <w:spacing w:lineRule="auto" w:line="288" w:before="0" w:after="0"/>
+        <w:ind w:hanging="0" w:start="0" w:end="0"/>
+        <w:rPr>
+          <w:rFonts w:cs="Noto Serif Thai"/>
+          <w:sz w:val="32"/>
+          <w:szCs w:val="32"/>
+          <w:lang w:bidi="th-TH"/>
+        </w:rPr>
+      </w:pPr>
+      <w:r>
+        <w:rPr>
+          <w:rFonts w:cs="Noto Serif Thai"/>
+          <w:sz w:val="32"/>
+          <w:szCs w:val="32"/>
+          <w:lang w:bidi="th-TH"/>
+        </w:rPr>
+        <w:t>สิบก้าว ยี่สิบก้าว สามสิบก้าว แสงระยิบระยับซึมเข้าสู่ร่างของเขา</w:t>
+      </w:r>
+      <w:r>
+        <w:rPr>
+          <w:rFonts w:cs="Noto Serif Thai"/>
+          <w:sz w:val="32"/>
+          <w:szCs w:val="32"/>
+          <w:lang w:bidi="th-TH"/>
+        </w:rPr>
+        <w:t>ในทุกครั้งที่เดิน</w:t>
+      </w:r>
+      <w:r>
+        <w:rPr>
+          <w:rFonts w:cs="Noto Serif Thai"/>
+          <w:sz w:val="32"/>
+          <w:szCs w:val="32"/>
+          <w:lang w:bidi="th-TH"/>
+        </w:rPr>
+        <w:t xml:space="preserve"> เขาเดินไปจนถึงสามสิบหกก้าวแล้วจึงไปต่อไม่ได้อีก</w:t>
+      </w:r>
+    </w:p>
+    <w:p>
+      <w:pPr>
+        <w:pStyle w:val="BodyText"/>
+        <w:bidi w:val="0"/>
+        <w:spacing w:lineRule="auto" w:line="288" w:before="0" w:after="0"/>
+        <w:ind w:hanging="0" w:start="0" w:end="0"/>
+        <w:rPr>
+          <w:rFonts w:cs="Noto Serif Thai"/>
+          <w:sz w:val="32"/>
+          <w:szCs w:val="32"/>
+          <w:lang w:bidi="th-TH"/>
+        </w:rPr>
+      </w:pPr>
+      <w:r>
+        <w:rPr>
+          <w:rFonts w:cs="Noto Serif Thai"/>
+          <w:sz w:val="32"/>
+          <w:szCs w:val="32"/>
+          <w:lang w:bidi="th-TH"/>
+        </w:rPr>
+      </w:r>
+    </w:p>
+    <w:p>
+      <w:pPr>
+        <w:pStyle w:val="BodyText"/>
+        <w:bidi w:val="0"/>
+        <w:spacing w:lineRule="auto" w:line="288" w:before="0" w:after="0"/>
+        <w:ind w:hanging="0" w:start="0" w:end="0"/>
+        <w:rPr>
+          <w:rFonts w:cs="Noto Serif Thai"/>
+          <w:sz w:val="32"/>
+          <w:szCs w:val="32"/>
+          <w:lang w:bidi="th-TH"/>
+        </w:rPr>
+      </w:pPr>
+      <w:r>
+        <w:rPr>
+          <w:rFonts w:cs="Noto Serif Thai"/>
+          <w:sz w:val="32"/>
+          <w:szCs w:val="32"/>
+          <w:lang w:bidi="th-TH"/>
+        </w:rPr>
+        <w:t>เหล่าหนุ่มสาวที่ริมแม่น้ำอีกฝั่งพากันเบิกตากว้างด้วยความตกใจ ส่วนผู้อาวุโสจากสถาบันของตระกูลก็กล่าวด้วยความยินดีปรีดา “เยี่ยม กู่เยว่โม่เป่ย พรสวรรค์ชั้นสอง</w:t>
+      </w:r>
+      <w:r>
+        <w:rPr>
+          <w:rFonts w:cs="Noto Serif Thai"/>
+          <w:sz w:val="32"/>
+          <w:szCs w:val="32"/>
+          <w:lang w:bidi="th-TH"/>
+        </w:rPr>
+        <w:t xml:space="preserve">! </w:t>
+      </w:r>
+      <w:r>
+        <w:rPr>
+          <w:rFonts w:cs="Noto Serif Thai"/>
+          <w:sz w:val="32"/>
+          <w:szCs w:val="32"/>
+          <w:lang w:bidi="th-TH"/>
+        </w:rPr>
+        <w:t>มานี้สิ ขอข้าดูทะเลต้นกำเนิดของเจ้าหน่อย”</w:t>
+      </w:r>
+    </w:p>
+    <w:p>
+      <w:pPr>
+        <w:pStyle w:val="BodyText"/>
+        <w:bidi w:val="0"/>
+        <w:spacing w:lineRule="auto" w:line="288" w:before="0" w:after="0"/>
+        <w:ind w:hanging="0" w:start="0" w:end="0"/>
+        <w:rPr>
+          <w:rFonts w:cs="Noto Serif Thai"/>
+          <w:sz w:val="32"/>
+          <w:szCs w:val="32"/>
+          <w:lang w:bidi="th-TH"/>
+        </w:rPr>
+      </w:pPr>
+      <w:r>
+        <w:rPr>
+          <w:rFonts w:cs="Noto Serif Thai"/>
+          <w:sz w:val="32"/>
+          <w:szCs w:val="32"/>
+          <w:lang w:bidi="th-TH"/>
+        </w:rPr>
+      </w:r>
+    </w:p>
+    <w:p>
+      <w:pPr>
+        <w:pStyle w:val="BodyText"/>
+        <w:bidi w:val="0"/>
+        <w:spacing w:lineRule="auto" w:line="288" w:before="0" w:after="0"/>
+        <w:ind w:hanging="0" w:start="0" w:end="0"/>
+        <w:rPr>
+          <w:rFonts w:cs="Noto Serif Thai"/>
+          <w:sz w:val="32"/>
+          <w:szCs w:val="32"/>
+          <w:lang w:bidi="th-TH"/>
+        </w:rPr>
+      </w:pPr>
+      <w:r>
+        <w:rPr>
+          <w:rFonts w:cs="Noto Serif Thai"/>
+          <w:sz w:val="32"/>
+          <w:szCs w:val="32"/>
+          <w:lang w:bidi="th-TH"/>
+        </w:rPr>
+        <w:t xml:space="preserve">กู่เยว่โม่เป่ยเดินไปทางฝั่งของผู้อาวุโสที่เรียก </w:t>
+      </w:r>
+      <w:r>
+        <w:rPr>
+          <w:rFonts w:cs="Noto Serif Thai"/>
+          <w:sz w:val="32"/>
+          <w:szCs w:val="32"/>
+          <w:lang w:bidi="th-TH"/>
+        </w:rPr>
+        <w:t>จากนั้น</w:t>
+      </w:r>
+      <w:r>
+        <w:rPr>
+          <w:rFonts w:cs="Noto Serif Thai"/>
+          <w:sz w:val="32"/>
+          <w:szCs w:val="32"/>
+          <w:lang w:bidi="th-TH"/>
+        </w:rPr>
+        <w:t>ผู้อาวุโส</w:t>
+      </w:r>
+      <w:r>
+        <w:rPr>
+          <w:rFonts w:cs="Noto Serif Thai"/>
+          <w:sz w:val="32"/>
+          <w:szCs w:val="32"/>
+          <w:lang w:bidi="th-TH"/>
+        </w:rPr>
+        <w:t>ก็ยกมือ</w:t>
+      </w:r>
+      <w:r>
+        <w:rPr>
+          <w:rFonts w:cs="Noto Serif Thai"/>
+          <w:sz w:val="32"/>
+          <w:szCs w:val="32"/>
+          <w:lang w:bidi="th-TH"/>
+        </w:rPr>
+        <w:t>วางบนไหล่ของเด็กหนุ่ม เขาหลับตาลงเพื่อเพ่งสมาธิตรวจสอบ หลังจากนั้นเขาก็ดึงมือกลับพร้อมพยักหน้า ก่อนจะลงมือบันทึกผลลงกระดาษ ‘กู่เยว่โม่เป่ย ทะเลต้นกำเนิดหกสิบหกส่วนร้อย เข้าเรียนต่อชั้นเรียนอี้”</w:t>
+      </w:r>
+    </w:p>
+    <w:p>
+      <w:pPr>
+        <w:pStyle w:val="BodyText"/>
+        <w:bidi w:val="0"/>
+        <w:spacing w:lineRule="auto" w:line="288" w:before="0" w:after="0"/>
+        <w:ind w:hanging="0" w:start="0" w:end="0"/>
+        <w:rPr>
+          <w:rFonts w:cs="Noto Serif Thai"/>
+          <w:sz w:val="32"/>
+          <w:szCs w:val="32"/>
+          <w:lang w:bidi="th-TH"/>
+        </w:rPr>
+      </w:pPr>
+      <w:r>
+        <w:rPr>
+          <w:rFonts w:cs="Noto Serif Thai"/>
+          <w:sz w:val="32"/>
+          <w:szCs w:val="32"/>
+          <w:lang w:bidi="th-TH"/>
+        </w:rPr>
+      </w:r>
+    </w:p>
+    <w:p>
+      <w:pPr>
+        <w:pStyle w:val="BodyText"/>
+        <w:bidi w:val="0"/>
+        <w:spacing w:lineRule="auto" w:line="288" w:before="0" w:after="0"/>
+        <w:ind w:hanging="0" w:start="0" w:end="0"/>
+        <w:rPr>
+          <w:rFonts w:cs="Noto Serif Thai"/>
+          <w:sz w:val="32"/>
+          <w:szCs w:val="32"/>
+          <w:lang w:bidi="th-TH"/>
+        </w:rPr>
+      </w:pPr>
+      <w:r>
+        <w:rPr>
+          <w:rFonts w:cs="Noto Serif Thai"/>
+          <w:sz w:val="32"/>
+          <w:szCs w:val="32"/>
+          <w:lang w:bidi="th-TH"/>
+        </w:rPr>
+        <w:t>พรสวรรค์พิเศษนี้สามารถถูกวัดได้สี่ชั้น</w:t>
+      </w:r>
+      <w:r>
+        <w:rPr>
+          <w:rFonts w:cs="Noto Serif Thai"/>
+          <w:sz w:val="32"/>
+          <w:szCs w:val="32"/>
+          <w:lang w:bidi="th-TH"/>
+        </w:rPr>
+        <w:t>ตั้งแต่ชั้นหนึ่งถึงชั้นสี่ หากฝึกฝนผู้มีพรสวรรค์ชั้นสี่เป็นเวลาสามปี เขาสามารถขึ้นเป็นผู้อาวุโสปรมาจารย์กู่ลำดับหนึ่งและกลายเป็นรากฐานให้ตระกูล</w:t>
+      </w:r>
+    </w:p>
+    <w:p>
+      <w:pPr>
+        <w:pStyle w:val="BodyText"/>
+        <w:bidi w:val="0"/>
+        <w:spacing w:lineRule="auto" w:line="288" w:before="0" w:after="0"/>
+        <w:ind w:hanging="0" w:start="0" w:end="0"/>
+        <w:rPr>
+          <w:rFonts w:cs="Noto Serif Thai"/>
+          <w:sz w:val="32"/>
+          <w:szCs w:val="32"/>
+          <w:lang w:bidi="th-TH"/>
+        </w:rPr>
+      </w:pPr>
+      <w:r>
+        <w:rPr>
+          <w:rFonts w:cs="Noto Serif Thai"/>
+          <w:sz w:val="32"/>
+          <w:szCs w:val="32"/>
+          <w:lang w:bidi="th-TH"/>
+        </w:rPr>
+      </w:r>
+    </w:p>
+    <w:p>
+      <w:pPr>
+        <w:pStyle w:val="BodyText"/>
+        <w:bidi w:val="0"/>
+        <w:spacing w:lineRule="auto" w:line="288" w:before="0" w:after="0"/>
+        <w:ind w:hanging="0" w:start="0" w:end="0"/>
+        <w:rPr>
+          <w:rFonts w:cs="Noto Serif Thai"/>
+          <w:sz w:val="32"/>
+          <w:szCs w:val="32"/>
+          <w:lang w:bidi="th-TH"/>
+        </w:rPr>
+      </w:pPr>
+      <w:r>
+        <w:rPr>
+          <w:rFonts w:cs="Noto Serif Thai"/>
+          <w:sz w:val="32"/>
+          <w:szCs w:val="32"/>
+          <w:lang w:bidi="th-TH"/>
+        </w:rPr>
+        <w:t>หากฝึกฝนผู้มีพรสวรรค์ชั้นสาม ในเวลาสองปีก็มักจะกลายเป็นผู้อาวุโสปรมาจารย์กู่ลำดับสองและกลายเป็นกระดูกสันหลังของตระกูล</w:t>
+      </w:r>
+    </w:p>
+    <w:p>
+      <w:pPr>
+        <w:pStyle w:val="BodyText"/>
+        <w:bidi w:val="0"/>
+        <w:spacing w:lineRule="auto" w:line="288" w:before="0" w:after="0"/>
+        <w:ind w:hanging="0" w:start="0" w:end="0"/>
+        <w:rPr>
+          <w:rFonts w:cs="Noto Serif Thai"/>
+          <w:sz w:val="32"/>
+          <w:szCs w:val="32"/>
+          <w:lang w:bidi="th-TH"/>
+        </w:rPr>
+      </w:pPr>
+      <w:r>
+        <w:rPr>
+          <w:rFonts w:cs="Noto Serif Thai"/>
+          <w:sz w:val="32"/>
+          <w:szCs w:val="32"/>
+          <w:lang w:bidi="th-TH"/>
+        </w:rPr>
+      </w:r>
+    </w:p>
+    <w:p>
+      <w:pPr>
+        <w:pStyle w:val="BodyText"/>
+        <w:bidi w:val="0"/>
+        <w:spacing w:lineRule="auto" w:line="288" w:before="0" w:after="0"/>
+        <w:ind w:hanging="0" w:start="0" w:end="0"/>
+        <w:rPr>
+          <w:rFonts w:cs="Noto Serif Thai"/>
+          <w:sz w:val="32"/>
+          <w:szCs w:val="32"/>
+          <w:lang w:bidi="th-TH"/>
+        </w:rPr>
+      </w:pPr>
+      <w:r>
+        <w:rPr>
+          <w:rFonts w:cs="Noto Serif Thai"/>
+          <w:sz w:val="32"/>
+          <w:szCs w:val="32"/>
+          <w:lang w:bidi="th-TH"/>
+        </w:rPr>
+        <w:t>พรสวรรค์ชั้นสองต้องได้รับการดูแลเป็นพิเศษ พวกเขามักจะกลายเป็นผู้อาวุโสของตระกูลในอนาคต หลังหกถึงเจ็ดปีของการฝึกฝน พวกเขาจะกลายเป็นปรมาจารย์กู่ลำดับสาม</w:t>
+      </w:r>
+    </w:p>
+    <w:p>
+      <w:pPr>
+        <w:pStyle w:val="BodyText"/>
+        <w:bidi w:val="0"/>
+        <w:spacing w:lineRule="auto" w:line="288" w:before="0" w:after="0"/>
+        <w:ind w:hanging="0" w:start="0" w:end="0"/>
+        <w:rPr>
+          <w:rFonts w:cs="Noto Serif Thai"/>
+          <w:sz w:val="32"/>
+          <w:szCs w:val="32"/>
+          <w:lang w:bidi="th-TH"/>
+        </w:rPr>
+      </w:pPr>
+      <w:r>
+        <w:rPr>
+          <w:rFonts w:cs="Noto Serif Thai"/>
+          <w:sz w:val="32"/>
+          <w:szCs w:val="32"/>
+          <w:lang w:bidi="th-TH"/>
+        </w:rPr>
+      </w:r>
+    </w:p>
+    <w:p>
+      <w:pPr>
+        <w:pStyle w:val="BodyText"/>
+        <w:bidi w:val="0"/>
+        <w:spacing w:lineRule="auto" w:line="288" w:before="0" w:after="0"/>
+        <w:ind w:hanging="0" w:start="0" w:end="0"/>
+        <w:rPr>
+          <w:rFonts w:cs="Noto Serif Thai"/>
+          <w:sz w:val="32"/>
+          <w:szCs w:val="32"/>
+          <w:lang w:bidi="th-TH"/>
+        </w:rPr>
+      </w:pPr>
+      <w:r>
+        <w:rPr>
+          <w:rFonts w:cs="Noto Serif Thai"/>
+          <w:sz w:val="32"/>
+          <w:szCs w:val="32"/>
+          <w:lang w:bidi="th-TH"/>
+        </w:rPr>
+        <w:t>สำหรับพรสวรรค์ชั้นหนึ่ง หากมีแม้แต่คนเดียวปรากฏออกมาก็ถือเป็นโชคลาภครั้งใหญ่ของทั้งตระกูล ต้องได้รับการดูแลชั้นเลิศ ด้วยพรสวรรค์ระดับนี้ ภายในสิบปีก็สามารถเป็นปรมาจารย์กู่ลำดับสี่ ในตอนนั้นพวกเขาจะสามารถแข่งเพื่อแย่งตำแหน่งผู้นำตระกูลได้</w:t>
+      </w:r>
+      <w:r>
+        <w:rPr>
+          <w:rFonts w:cs="Noto Serif Thai"/>
+          <w:sz w:val="32"/>
+          <w:szCs w:val="32"/>
+          <w:lang w:bidi="th-TH"/>
+        </w:rPr>
+        <w:t>!</w:t>
+      </w:r>
+    </w:p>
+    <w:p>
+      <w:pPr>
+        <w:pStyle w:val="BodyText"/>
+        <w:bidi w:val="0"/>
+        <w:spacing w:lineRule="auto" w:line="288" w:before="0" w:after="0"/>
+        <w:ind w:hanging="0" w:start="0" w:end="0"/>
+        <w:rPr>
+          <w:rFonts w:cs="Noto Serif Thai"/>
+          <w:sz w:val="32"/>
+          <w:szCs w:val="32"/>
+          <w:lang w:bidi="th-TH"/>
+        </w:rPr>
+      </w:pPr>
+      <w:r>
+        <w:rPr>
+          <w:rFonts w:cs="Noto Serif Thai"/>
+          <w:sz w:val="32"/>
+          <w:szCs w:val="32"/>
+          <w:lang w:bidi="th-TH"/>
+        </w:rPr>
+      </w:r>
+    </w:p>
+    <w:p>
+      <w:pPr>
+        <w:pStyle w:val="BodyText"/>
+        <w:bidi w:val="0"/>
+        <w:spacing w:lineRule="auto" w:line="288" w:before="0" w:after="0"/>
+        <w:ind w:hanging="0" w:start="0" w:end="0"/>
+        <w:rPr>
+          <w:rFonts w:cs="Noto Serif Thai"/>
+          <w:sz w:val="32"/>
+          <w:szCs w:val="32"/>
+          <w:lang w:bidi="th-TH"/>
+        </w:rPr>
+      </w:pPr>
+      <w:r>
+        <w:rPr>
+          <w:rFonts w:cs="Noto Serif Thai"/>
+          <w:sz w:val="32"/>
+          <w:szCs w:val="32"/>
+          <w:lang w:bidi="th-TH"/>
+        </w:rPr>
+        <w:t>หรือก็คือ ตราบใดที่กู่เยว่โม่เป่ยเติบโตขึ้น ในท้ายที่สุดนั้นเขาจะกลายเป็นหนึ่งในผู้อาวุโสของตระกูลกู่เยว่ เป็นเหตุว่าทำไมผู้อาวุโสจากสถานบันถือหัวเราะดีใจเช่นนั้น เหล่าผู้อาวุโสที่มองดูจากความมืดก็ถอดทอนหายใจอย่างโล่งอก หลังจากนั้นก็จ้องมองไปที่ผู้อาวุโสคนหนึ่งในหมู่พวกเขาเป็นตาเดียวด้วยความริษยา</w:t>
+      </w:r>
+    </w:p>
+    <w:p>
+      <w:pPr>
+        <w:pStyle w:val="BodyText"/>
+        <w:bidi w:val="0"/>
+        <w:spacing w:lineRule="auto" w:line="288" w:before="0" w:after="0"/>
+        <w:ind w:hanging="0" w:start="0" w:end="0"/>
+        <w:rPr>
+          <w:rFonts w:cs="Noto Serif Thai"/>
+          <w:sz w:val="32"/>
+          <w:szCs w:val="32"/>
+          <w:lang w:bidi="th-TH"/>
+        </w:rPr>
+      </w:pPr>
+      <w:r>
+        <w:rPr>
+          <w:rFonts w:cs="Noto Serif Thai"/>
+          <w:sz w:val="32"/>
+          <w:szCs w:val="32"/>
+          <w:lang w:bidi="th-TH"/>
+        </w:rPr>
+      </w:r>
+    </w:p>
+    <w:p>
+      <w:pPr>
+        <w:pStyle w:val="BodyText"/>
+        <w:bidi w:val="0"/>
+        <w:spacing w:lineRule="auto" w:line="288" w:before="0" w:after="0"/>
+        <w:ind w:hanging="0" w:start="0" w:end="0"/>
+        <w:rPr>
+          <w:rFonts w:cs="Noto Serif Thai"/>
+          <w:sz w:val="32"/>
+          <w:szCs w:val="32"/>
+          <w:lang w:bidi="th-TH"/>
+        </w:rPr>
+      </w:pPr>
+      <w:r>
+        <w:rPr>
+          <w:rFonts w:cs="Noto Serif Thai"/>
+          <w:sz w:val="32"/>
+          <w:szCs w:val="32"/>
+          <w:lang w:bidi="th-TH"/>
+        </w:rPr>
+        <w:t>ผู้อาวุโสคนนั้นมีหน้ายาวคล้ายม้าเหมือนกัน กู่เยว่โม่เฉิน หรือ</w:t>
+      </w:r>
+      <w:r>
+        <w:rPr>
+          <w:rFonts w:cs="Noto Serif Thai"/>
+          <w:sz w:val="32"/>
+          <w:szCs w:val="32"/>
+          <w:lang w:bidi="th-TH"/>
+        </w:rPr>
+        <w:t>ก็คือ</w:t>
+      </w:r>
+      <w:r>
+        <w:rPr>
+          <w:rFonts w:cs="Noto Serif Thai"/>
+          <w:sz w:val="32"/>
+          <w:szCs w:val="32"/>
+          <w:lang w:bidi="th-TH"/>
+        </w:rPr>
+        <w:t>ท่านปู่ของ</w:t>
+      </w:r>
+      <w:r>
+        <w:rPr>
+          <w:rFonts w:cs="Noto Serif Thai"/>
+          <w:sz w:val="32"/>
+          <w:szCs w:val="32"/>
+          <w:lang w:bidi="th-TH"/>
+        </w:rPr>
+        <w:t>กู่</w:t>
+      </w:r>
+      <w:r>
+        <w:rPr>
+          <w:rFonts w:cs="Noto Serif Thai"/>
+          <w:sz w:val="32"/>
+          <w:szCs w:val="32"/>
+          <w:lang w:bidi="th-TH"/>
+        </w:rPr>
+        <w:t xml:space="preserve">เยว่โม่เป่ย </w:t>
+      </w:r>
+      <w:r>
+        <w:rPr>
+          <w:rFonts w:cs="Noto Serif Thai"/>
+          <w:sz w:val="32"/>
+          <w:szCs w:val="32"/>
+          <w:lang w:bidi="th-TH"/>
+        </w:rPr>
+        <w:t>ในตอนนี้เขากำลังยิ้มกว้างก่อนหันหน้าไปมองอย่างเยาะเย้ยใส่คู่แข่งตัวฉกาจของเขาแล้วพูดว่า “เจ้าคิดว่าอย่างไรล่ะ</w:t>
+      </w:r>
+      <w:r>
+        <w:rPr>
+          <w:rFonts w:cs="Noto Serif Thai"/>
+          <w:sz w:val="32"/>
+          <w:szCs w:val="32"/>
+          <w:lang w:bidi="th-TH"/>
+        </w:rPr>
+        <w:t xml:space="preserve">? </w:t>
+      </w:r>
+      <w:r>
+        <w:rPr>
+          <w:rFonts w:cs="Noto Serif Thai"/>
+          <w:sz w:val="32"/>
+          <w:szCs w:val="32"/>
+          <w:lang w:bidi="th-TH"/>
+        </w:rPr>
+        <w:t>กู่เยว่ชื่อเลี่ยน หลานชายข้าก็ไม่ได้แย่เลยใช่ไหมล่ะ</w:t>
+      </w:r>
+      <w:r>
+        <w:rPr>
+          <w:rFonts w:cs="Noto Serif Thai"/>
+          <w:sz w:val="32"/>
+          <w:szCs w:val="32"/>
+          <w:lang w:bidi="th-TH"/>
+        </w:rPr>
+        <w:t>?”</w:t>
+      </w:r>
+    </w:p>
+    <w:p>
+      <w:pPr>
+        <w:pStyle w:val="BodyText"/>
+        <w:bidi w:val="0"/>
+        <w:spacing w:lineRule="auto" w:line="288" w:before="0" w:after="0"/>
+        <w:ind w:hanging="0" w:start="0" w:end="0"/>
+        <w:rPr>
+          <w:rFonts w:cs="Noto Serif Thai"/>
+          <w:sz w:val="32"/>
+          <w:szCs w:val="32"/>
+          <w:lang w:bidi="th-TH"/>
+        </w:rPr>
+      </w:pPr>
+      <w:r>
+        <w:rPr>
+          <w:rFonts w:cs="Noto Serif Thai"/>
+          <w:sz w:val="32"/>
+          <w:szCs w:val="32"/>
+          <w:lang w:bidi="th-TH"/>
+        </w:rPr>
+      </w:r>
+    </w:p>
+    <w:p>
+      <w:pPr>
+        <w:pStyle w:val="BodyText"/>
+        <w:bidi w:val="0"/>
+        <w:spacing w:lineRule="auto" w:line="288" w:before="0" w:after="0"/>
+        <w:ind w:hanging="0" w:start="0" w:end="0"/>
+        <w:rPr>
+          <w:rFonts w:cs="Noto Serif Thai"/>
+          <w:sz w:val="32"/>
+          <w:szCs w:val="32"/>
+          <w:lang w:bidi="th-TH"/>
+        </w:rPr>
+      </w:pPr>
+      <w:r>
+        <w:rPr>
+          <w:rFonts w:cs="Noto Serif Thai"/>
+          <w:sz w:val="32"/>
+          <w:szCs w:val="32"/>
+          <w:lang w:bidi="th-TH"/>
+        </w:rPr>
+        <w:t>กูเยว่ชื่อเลี่ยนมีเส้นผมสีแดงทั่วศีรษะ เขาส่งเสียง “หึ” อย่างรำคาญและไม่ได้ตอบกลับอีกฝ่ายไป ใบหน้าของเขาเคร่งเครียดอย่างเห็นได้ชัด</w:t>
+      </w:r>
+    </w:p>
+    <w:p>
+      <w:pPr>
+        <w:pStyle w:val="BodyText"/>
+        <w:bidi w:val="0"/>
+        <w:spacing w:lineRule="auto" w:line="288" w:before="0" w:after="0"/>
+        <w:ind w:hanging="0" w:start="0" w:end="0"/>
+        <w:rPr>
+          <w:rFonts w:cs="Noto Serif Thai"/>
+          <w:sz w:val="32"/>
+          <w:szCs w:val="32"/>
+          <w:lang w:bidi="th-TH"/>
+        </w:rPr>
+      </w:pPr>
+      <w:r>
+        <w:rPr>
+          <w:rFonts w:cs="Noto Serif Thai"/>
+          <w:sz w:val="32"/>
+          <w:szCs w:val="32"/>
+          <w:lang w:bidi="th-TH"/>
+        </w:rPr>
+      </w:r>
+    </w:p>
+    <w:p>
+      <w:pPr>
+        <w:pStyle w:val="BodyText"/>
+        <w:bidi w:val="0"/>
+        <w:spacing w:lineRule="auto" w:line="288" w:before="0" w:after="0"/>
+        <w:ind w:hanging="0" w:start="0" w:end="0"/>
+        <w:rPr>
+          <w:rFonts w:cs="Noto Serif Thai"/>
+          <w:sz w:val="32"/>
+          <w:szCs w:val="32"/>
+          <w:lang w:bidi="th-TH"/>
+        </w:rPr>
+      </w:pPr>
+      <w:r>
+        <w:rPr>
+          <w:rFonts w:cs="Noto Serif Thai"/>
+          <w:sz w:val="32"/>
+          <w:szCs w:val="32"/>
+          <w:lang w:bidi="th-TH"/>
+        </w:rPr>
+        <w:t>ครึ่งชั่วยามผ่านไป ครึ่งหนึ่งของเหล่าวัยรุ่นก็ได้ทดสอบเดินข้ามผ่านทะเลดอกไม้ไปแล้ว จำนวนผู้มีพรสวรรค์ชั้นสามกับสี่มีค่อนข้างมาก และผู้ที่ไม่มีพรสวรรค์เลยก็มีจำนวนครึ่งหนึ่งจากทั้งหมด</w:t>
+      </w:r>
+      <w:r>
+        <w:br w:type="page"/>
+      </w:r>
+    </w:p>
+    <w:p>
+      <w:pPr>
+        <w:pStyle w:val="BodyText"/>
+        <w:bidi w:val="0"/>
+        <w:spacing w:lineRule="auto" w:line="288" w:before="0" w:after="0"/>
+        <w:ind w:hanging="0" w:start="0" w:end="0"/>
+        <w:rPr>
+          <w:rFonts w:cs="Noto Serif Thai"/>
+          <w:sz w:val="32"/>
+          <w:szCs w:val="32"/>
+          <w:lang w:bidi="th-TH"/>
+        </w:rPr>
+      </w:pPr>
+      <w:r>
+        <w:rPr>
+          <w:rFonts w:cs="Noto Serif Thai"/>
+          <w:sz w:val="32"/>
+          <w:szCs w:val="32"/>
+          <w:lang w:bidi="th-TH"/>
+        </w:rPr>
+        <w:t>“</w:t>
+      </w:r>
+      <w:r>
+        <w:rPr>
+          <w:rFonts w:cs="Noto Serif Thai"/>
+          <w:sz w:val="32"/>
+          <w:szCs w:val="32"/>
+          <w:lang w:bidi="th-TH"/>
+        </w:rPr>
+        <w:t>เห้อ</w:t>
+      </w:r>
+      <w:r>
+        <w:rPr>
+          <w:rFonts w:cs="Noto Serif Thai"/>
+          <w:sz w:val="32"/>
+          <w:szCs w:val="32"/>
+          <w:lang w:bidi="th-TH"/>
+        </w:rPr>
+        <w:t xml:space="preserve">... </w:t>
+      </w:r>
+      <w:r>
+        <w:rPr>
+          <w:rFonts w:cs="Noto Serif Thai"/>
+          <w:sz w:val="32"/>
+          <w:szCs w:val="32"/>
+          <w:lang w:bidi="th-TH"/>
+        </w:rPr>
+        <w:t>นับวันสายเลือดยิ่ง</w:t>
+      </w:r>
+      <w:r>
+        <w:rPr>
+          <w:rFonts w:cs="Noto Serif Thai"/>
+          <w:sz w:val="32"/>
+          <w:szCs w:val="32"/>
+          <w:lang w:bidi="th-TH"/>
+        </w:rPr>
+        <w:t>บางลงเรื่อยๆ</w:t>
+      </w:r>
+      <w:r>
+        <w:rPr>
+          <w:rFonts w:cs="Noto Serif Thai"/>
+          <w:sz w:val="32"/>
+          <w:szCs w:val="32"/>
+          <w:lang w:bidi="th-TH"/>
+        </w:rPr>
+        <w:t xml:space="preserve"> ในช่วงไม่กี่ปีที่ผ่านมานี้ ตระกูลไม่มีปรมาจารย์ลำดับสี่มาเสริมแกร่งสายเลือดเลย ผู้นำตระกูลรุ่นที่สี่เป็นปรมาจารย์ลำดับที่ห้าเพียงคนเดียวเท่านั้น แต่ท่านก็ดันหายตัวไปพร้อมกับนักบวชสุราบุปผาและไม่มีผู้สืบสกุลเลยแม้แต่คนเดียว คนรุ่นหลังก็อ่อนแอขึ้นเรื่อยๆ” ผู้นำตระกูลถอนหายใจยาว</w:t>
+      </w:r>
+    </w:p>
+    <w:p>
+      <w:pPr>
+        <w:pStyle w:val="BodyText"/>
+        <w:bidi w:val="0"/>
+        <w:spacing w:lineRule="auto" w:line="288" w:before="0" w:after="0"/>
+        <w:ind w:hanging="0" w:start="0" w:end="0"/>
+        <w:rPr>
+          <w:rFonts w:cs="Noto Serif Thai"/>
+          <w:sz w:val="32"/>
+          <w:szCs w:val="32"/>
+          <w:lang w:bidi="th-TH"/>
+        </w:rPr>
+      </w:pPr>
+      <w:r>
+        <w:rPr>
+          <w:rFonts w:cs="Noto Serif Thai"/>
+          <w:sz w:val="32"/>
+          <w:szCs w:val="32"/>
+          <w:lang w:bidi="th-TH"/>
+        </w:rPr>
+      </w:r>
+    </w:p>
+    <w:p>
+      <w:pPr>
+        <w:pStyle w:val="BodyText"/>
+        <w:bidi w:val="0"/>
+        <w:spacing w:lineRule="auto" w:line="288" w:before="0" w:after="0"/>
+        <w:ind w:hanging="0" w:start="0" w:end="0"/>
+        <w:rPr>
+          <w:rFonts w:cs="Noto Serif Thai"/>
+          <w:sz w:val="32"/>
+          <w:szCs w:val="32"/>
+          <w:lang w:bidi="th-TH"/>
+        </w:rPr>
+      </w:pPr>
+      <w:r>
+        <w:rPr>
+          <w:rFonts w:cs="Noto Serif Thai"/>
+          <w:sz w:val="32"/>
+          <w:szCs w:val="32"/>
+          <w:lang w:bidi="th-TH"/>
+        </w:rPr>
+        <w:t>ในจังหวะนั้นเอง ผู้อาวุโสจากสถาบันก็ตะโกนขานชื่อ “กู่เยว่ชื่อเฉิง</w:t>
+      </w:r>
+      <w:r>
+        <w:rPr>
+          <w:rFonts w:cs="Noto Serif Thai"/>
+          <w:sz w:val="32"/>
+          <w:szCs w:val="32"/>
+          <w:lang w:bidi="th-TH"/>
+        </w:rPr>
+        <w:t>!”</w:t>
+      </w:r>
+    </w:p>
+    <w:p>
+      <w:pPr>
+        <w:pStyle w:val="BodyText"/>
+        <w:bidi w:val="0"/>
+        <w:spacing w:lineRule="auto" w:line="288" w:before="0" w:after="0"/>
+        <w:ind w:hanging="0" w:start="0" w:end="0"/>
+        <w:rPr>
+          <w:rFonts w:cs="Noto Serif Thai"/>
+          <w:sz w:val="32"/>
+          <w:szCs w:val="32"/>
+          <w:lang w:bidi="th-TH"/>
+        </w:rPr>
+      </w:pPr>
+      <w:r>
+        <w:rPr>
+          <w:rFonts w:cs="Noto Serif Thai"/>
+          <w:sz w:val="32"/>
+          <w:szCs w:val="32"/>
+          <w:lang w:bidi="th-TH"/>
+        </w:rPr>
+      </w:r>
+    </w:p>
+    <w:p>
+      <w:pPr>
+        <w:pStyle w:val="BodyText"/>
+        <w:bidi w:val="0"/>
+        <w:spacing w:lineRule="auto" w:line="288" w:before="0" w:after="0"/>
+        <w:ind w:hanging="0" w:start="0" w:end="0"/>
+        <w:rPr>
+          <w:rFonts w:cs="Noto Serif Thai"/>
+          <w:sz w:val="32"/>
+          <w:szCs w:val="32"/>
+          <w:lang w:bidi="th-TH"/>
+        </w:rPr>
+      </w:pPr>
+      <w:r>
+        <w:rPr>
+          <w:rFonts w:cs="Noto Serif Thai"/>
+          <w:sz w:val="32"/>
+          <w:szCs w:val="32"/>
+          <w:lang w:bidi="th-TH"/>
+        </w:rPr>
+        <w:t>เมื่อได้ยินชื่อนั้น ผู้อาวุโสทุกคนก็หันไปมองทางกู่เยว่ชื่อเลี่ยนเพราะว่านั้นคือหลายชายของเขา</w:t>
+      </w:r>
+    </w:p>
+    <w:p>
+      <w:pPr>
+        <w:pStyle w:val="BodyText"/>
+        <w:bidi w:val="0"/>
+        <w:spacing w:lineRule="auto" w:line="288" w:before="0" w:after="0"/>
+        <w:ind w:hanging="0" w:start="0" w:end="0"/>
+        <w:rPr>
+          <w:rFonts w:cs="Noto Serif Thai"/>
+          <w:sz w:val="32"/>
+          <w:szCs w:val="32"/>
+          <w:lang w:bidi="th-TH"/>
+        </w:rPr>
+      </w:pPr>
+      <w:r>
+        <w:rPr>
+          <w:rFonts w:cs="Noto Serif Thai"/>
+          <w:sz w:val="32"/>
+          <w:szCs w:val="32"/>
+          <w:lang w:bidi="th-TH"/>
+        </w:rPr>
+      </w:r>
+    </w:p>
+    <w:p>
+      <w:pPr>
+        <w:pStyle w:val="BodyText"/>
+        <w:bidi w:val="0"/>
+        <w:spacing w:lineRule="auto" w:line="288" w:before="0" w:after="0"/>
+        <w:ind w:hanging="0" w:start="0" w:end="0"/>
+        <w:rPr>
+          <w:rFonts w:cs="Noto Serif Thai"/>
+          <w:sz w:val="32"/>
+          <w:szCs w:val="32"/>
+          <w:lang w:bidi="th-TH"/>
+        </w:rPr>
+      </w:pPr>
+      <w:r>
+        <w:rPr>
+          <w:rFonts w:cs="Noto Serif Thai"/>
+          <w:sz w:val="32"/>
+          <w:szCs w:val="32"/>
+          <w:lang w:bidi="th-TH"/>
+        </w:rPr>
+        <w:t>กู่เย</w:t>
+      </w:r>
+      <w:r>
+        <w:rPr>
+          <w:rFonts w:cs="Noto Serif Thai"/>
+          <w:sz w:val="32"/>
+          <w:szCs w:val="32"/>
+          <w:lang w:bidi="th-TH"/>
+        </w:rPr>
+        <w:t>ว่</w:t>
+      </w:r>
+      <w:r>
+        <w:rPr>
+          <w:rFonts w:cs="Noto Serif Thai"/>
+          <w:sz w:val="32"/>
+          <w:szCs w:val="32"/>
+          <w:lang w:bidi="th-TH"/>
+        </w:rPr>
+        <w:t>ชื่อเ</w:t>
+      </w:r>
+      <w:r>
+        <w:rPr>
+          <w:rFonts w:cs="Noto Serif Thai"/>
+          <w:sz w:val="32"/>
+          <w:szCs w:val="32"/>
+          <w:lang w:bidi="th-TH"/>
+        </w:rPr>
+        <w:t>ฉิง</w:t>
+      </w:r>
+      <w:r>
+        <w:rPr>
+          <w:rFonts w:cs="Noto Serif Thai"/>
+          <w:sz w:val="32"/>
+          <w:szCs w:val="32"/>
+          <w:lang w:bidi="th-TH"/>
+        </w:rPr>
+        <w:t xml:space="preserve">มีรูปร่างเตี้ยเล็กและใบหน้าเต็มไปด้วยรอยปรุ </w:t>
+      </w:r>
+      <w:r>
+        <w:rPr>
+          <w:rFonts w:cs="Noto Serif Thai"/>
+          <w:sz w:val="32"/>
+          <w:szCs w:val="32"/>
+          <w:lang w:bidi="th-TH"/>
+        </w:rPr>
+        <w:t>เขากำหมัดแน่น เหงื่อผุดเต็มใบหน้า มันคือหลักฐานว่าเขานั้นกำลังประหม่าอย่างถึงที่สุด</w:t>
+      </w:r>
+    </w:p>
+    <w:p>
+      <w:pPr>
+        <w:pStyle w:val="BodyText"/>
+        <w:bidi w:val="0"/>
+        <w:spacing w:lineRule="auto" w:line="288" w:before="0" w:after="0"/>
+        <w:ind w:hanging="0" w:start="0" w:end="0"/>
+        <w:rPr>
+          <w:rFonts w:cs="Noto Serif Thai"/>
+          <w:sz w:val="32"/>
+          <w:szCs w:val="32"/>
+          <w:lang w:bidi="th-TH"/>
+        </w:rPr>
+      </w:pPr>
+      <w:r>
+        <w:rPr>
+          <w:rFonts w:cs="Noto Serif Thai"/>
+          <w:sz w:val="32"/>
+          <w:szCs w:val="32"/>
+          <w:lang w:bidi="th-TH"/>
+        </w:rPr>
+      </w:r>
+    </w:p>
+    <w:p>
+      <w:pPr>
+        <w:pStyle w:val="BodyText"/>
+        <w:bidi w:val="0"/>
+        <w:spacing w:lineRule="auto" w:line="288" w:before="0" w:after="0"/>
+        <w:ind w:hanging="0" w:start="0" w:end="0"/>
+        <w:rPr>
+          <w:rFonts w:cs="Noto Serif Thai"/>
+          <w:sz w:val="32"/>
+          <w:szCs w:val="32"/>
+          <w:lang w:bidi="th-TH"/>
+        </w:rPr>
+      </w:pPr>
+      <w:r>
+        <w:rPr>
+          <w:rFonts w:cs="Noto Serif Thai"/>
+          <w:sz w:val="32"/>
+          <w:szCs w:val="32"/>
+          <w:lang w:bidi="th-TH"/>
+        </w:rPr>
+        <w:t>เมื่อเด็กหนุ่มเดินข้ามไปอีกฝากของแม่น้ำ แสงดวงเล็กดวงน้อยก็ซึมเข้าร่างของเขา หลังจากเดินตรงไปสามสิบหกก้าวเขาก็หยุดเดิน</w:t>
+      </w:r>
+    </w:p>
+    <w:p>
+      <w:pPr>
+        <w:pStyle w:val="BodyText"/>
+        <w:bidi w:val="0"/>
+        <w:spacing w:lineRule="auto" w:line="288" w:before="0" w:after="0"/>
+        <w:ind w:hanging="0" w:start="0" w:end="0"/>
+        <w:rPr>
+          <w:rFonts w:cs="Noto Serif Thai"/>
+          <w:sz w:val="32"/>
+          <w:szCs w:val="32"/>
+          <w:lang w:bidi="th-TH"/>
+        </w:rPr>
+      </w:pPr>
+      <w:r>
+        <w:rPr>
+          <w:rFonts w:cs="Noto Serif Thai"/>
+          <w:sz w:val="32"/>
+          <w:szCs w:val="32"/>
+          <w:lang w:bidi="th-TH"/>
+        </w:rPr>
+      </w:r>
+    </w:p>
+    <w:p>
+      <w:pPr>
+        <w:pStyle w:val="BodyText"/>
+        <w:bidi w:val="0"/>
+        <w:spacing w:lineRule="auto" w:line="288" w:before="0" w:after="0"/>
+        <w:ind w:hanging="0" w:start="0" w:end="0"/>
+        <w:rPr>
+          <w:rFonts w:cs="Noto Serif Thai"/>
+          <w:sz w:val="32"/>
+          <w:szCs w:val="32"/>
+          <w:lang w:bidi="th-TH"/>
+        </w:rPr>
+      </w:pPr>
+      <w:r>
+        <w:rPr>
+          <w:rFonts w:cs="Noto Serif Thai"/>
+          <w:sz w:val="32"/>
+          <w:szCs w:val="32"/>
+          <w:lang w:bidi="th-TH"/>
+        </w:rPr>
+        <w:t>“</w:t>
+      </w:r>
+      <w:r>
+        <w:rPr>
+          <w:rFonts w:cs="Noto Serif Thai"/>
+          <w:sz w:val="32"/>
+          <w:szCs w:val="32"/>
+          <w:lang w:bidi="th-TH"/>
+        </w:rPr>
+        <w:t>ชั้นสองอีกคน</w:t>
+      </w:r>
+      <w:r>
+        <w:rPr>
+          <w:rFonts w:cs="Noto Serif Thai"/>
+          <w:sz w:val="32"/>
+          <w:szCs w:val="32"/>
+          <w:lang w:bidi="th-TH"/>
+        </w:rPr>
+        <w:t xml:space="preserve">!” </w:t>
+      </w:r>
+      <w:r>
+        <w:rPr>
+          <w:rFonts w:cs="Noto Serif Thai"/>
+          <w:sz w:val="32"/>
+          <w:szCs w:val="32"/>
+          <w:lang w:bidi="th-TH"/>
+        </w:rPr>
+        <w:t>ผู้อาวุโสจากสถาบันตะโกน</w:t>
+      </w:r>
+    </w:p>
+    <w:p>
+      <w:pPr>
+        <w:pStyle w:val="BodyText"/>
+        <w:bidi w:val="0"/>
+        <w:spacing w:lineRule="auto" w:line="288" w:before="0" w:after="0"/>
+        <w:ind w:hanging="0" w:start="0" w:end="0"/>
+        <w:rPr>
+          <w:rFonts w:cs="Noto Serif Thai"/>
+          <w:sz w:val="32"/>
+          <w:szCs w:val="32"/>
+          <w:lang w:bidi="th-TH"/>
+        </w:rPr>
+      </w:pPr>
+      <w:r>
+        <w:rPr>
+          <w:rFonts w:cs="Noto Serif Thai"/>
+          <w:sz w:val="32"/>
+          <w:szCs w:val="32"/>
+          <w:lang w:bidi="th-TH"/>
+        </w:rPr>
+      </w:r>
+    </w:p>
+    <w:p>
+      <w:pPr>
+        <w:pStyle w:val="BodyText"/>
+        <w:bidi w:val="0"/>
+        <w:spacing w:lineRule="auto" w:line="288" w:before="0" w:after="0"/>
+        <w:ind w:hanging="0" w:start="0" w:end="0"/>
+        <w:rPr>
+          <w:rFonts w:cs="Noto Serif Thai"/>
+          <w:sz w:val="32"/>
+          <w:szCs w:val="32"/>
+          <w:lang w:bidi="th-TH"/>
+        </w:rPr>
+      </w:pPr>
+      <w:r>
+        <w:rPr>
+          <w:rFonts w:cs="Noto Serif Thai"/>
+          <w:sz w:val="32"/>
+          <w:szCs w:val="32"/>
+          <w:lang w:bidi="th-TH"/>
+        </w:rPr>
+        <w:t>“</w:t>
+      </w:r>
+      <w:r>
+        <w:rPr>
+          <w:rFonts w:cs="Noto Serif Thai"/>
+          <w:sz w:val="32"/>
+          <w:szCs w:val="32"/>
+          <w:lang w:bidi="th-TH"/>
+        </w:rPr>
+        <w:t>ฮ่าฮ่าฮ่า สามสิบหกก้าว</w:t>
+      </w:r>
+      <w:r>
+        <w:rPr>
+          <w:rFonts w:cs="Noto Serif Thai"/>
+          <w:sz w:val="32"/>
+          <w:szCs w:val="32"/>
+          <w:lang w:bidi="th-TH"/>
+        </w:rPr>
+        <w:t xml:space="preserve">! </w:t>
+      </w:r>
+      <w:r>
+        <w:rPr>
+          <w:rFonts w:cs="Noto Serif Thai"/>
+          <w:sz w:val="32"/>
+          <w:szCs w:val="32"/>
+          <w:lang w:bidi="th-TH"/>
+        </w:rPr>
+        <w:t>สามสิบหกก้าว</w:t>
+      </w:r>
+      <w:r>
+        <w:rPr>
+          <w:rFonts w:cs="Noto Serif Thai"/>
+          <w:sz w:val="32"/>
+          <w:szCs w:val="32"/>
+          <w:lang w:bidi="th-TH"/>
+        </w:rPr>
+        <w:t xml:space="preserve">!” </w:t>
+      </w:r>
+      <w:r>
+        <w:rPr>
+          <w:rFonts w:cs="Noto Serif Thai"/>
+          <w:sz w:val="32"/>
+          <w:szCs w:val="32"/>
+          <w:lang w:bidi="th-TH"/>
+        </w:rPr>
+        <w:t>กู่เยว่ชื่อเลี่ยนกู่ร้อง เขามองไปที่กู่เยว่โม่เป่ยอย่างภาคภูมิใจ ในจังหวะนั้นกู่เยว่โม่เฉินก็หน้าถอดสี</w:t>
+      </w:r>
+    </w:p>
+    <w:p>
+      <w:pPr>
+        <w:pStyle w:val="BodyText"/>
+        <w:bidi w:val="0"/>
+        <w:spacing w:lineRule="auto" w:line="288" w:before="0" w:after="0"/>
+        <w:ind w:hanging="0" w:start="0" w:end="0"/>
+        <w:rPr>
+          <w:rFonts w:cs="Noto Serif Thai"/>
+          <w:sz w:val="32"/>
+          <w:szCs w:val="32"/>
+          <w:lang w:bidi="th-TH"/>
+        </w:rPr>
+      </w:pPr>
+      <w:r>
+        <w:rPr>
+          <w:rFonts w:cs="Noto Serif Thai"/>
+          <w:sz w:val="32"/>
+          <w:szCs w:val="32"/>
+          <w:lang w:bidi="th-TH"/>
+        </w:rPr>
+      </w:r>
+    </w:p>
+    <w:p>
+      <w:pPr>
+        <w:pStyle w:val="BodyText"/>
+        <w:bidi w:val="0"/>
+        <w:spacing w:lineRule="auto" w:line="288" w:before="0" w:after="0"/>
+        <w:ind w:hanging="0" w:start="0" w:end="0"/>
+        <w:rPr>
+          <w:rFonts w:cs="Noto Serif Thai"/>
+          <w:sz w:val="32"/>
+          <w:szCs w:val="32"/>
+          <w:lang w:bidi="th-TH"/>
+        </w:rPr>
+      </w:pPr>
+      <w:r>
+        <w:rPr>
+          <w:rFonts w:cs="Noto Serif Thai"/>
+          <w:sz w:val="32"/>
+          <w:szCs w:val="32"/>
+          <w:lang w:bidi="th-TH"/>
+        </w:rPr>
+        <w:t>“</w:t>
+      </w:r>
+      <w:r>
+        <w:rPr>
+          <w:rFonts w:cs="Noto Serif Thai"/>
+          <w:sz w:val="32"/>
+          <w:szCs w:val="32"/>
+          <w:lang w:bidi="th-TH"/>
+        </w:rPr>
+        <w:t>กู่เยว่ชื่อเฉิงงั้นเรอะ…” ท่ามกลางหมู่คน ฟางหยวนลูบคางของตัวเขาพลางคบคิด ในความทรงจำของเขา ตระกูลลงโทษกู่เยว่ชื่อเฉิงอย่างหนักเพราะเขาโกงพิธีเบิกทวาร แท้จริงแล้วชื่อเฉิงมีพรสวรรค์เพียงชั้นสามเท่านั้น แต่ว่าคุณปู่ของเขาอย่างกู่เยว่ชื่อเลี่ยนช่วยเขาในการปลอมแปลงผลลัพธ์ นั่นเป็นเหตุที่ทำไมเ</w:t>
+      </w:r>
+      <w:r>
+        <w:rPr>
+          <w:rFonts w:cs="Noto Serif Thai"/>
+          <w:sz w:val="32"/>
+          <w:szCs w:val="32"/>
+          <w:lang w:bidi="th-TH"/>
+        </w:rPr>
+        <w:t>ด็กหนุ่ม</w:t>
+      </w:r>
+      <w:r>
+        <w:rPr>
+          <w:rFonts w:cs="Noto Serif Thai"/>
+          <w:sz w:val="32"/>
+          <w:szCs w:val="32"/>
+          <w:lang w:bidi="th-TH"/>
+        </w:rPr>
+        <w:t>ถึงปรากฏว่ามีพรสวรรค์ชั้นสอง</w:t>
+      </w:r>
+    </w:p>
+    <w:p>
+      <w:pPr>
+        <w:pStyle w:val="BodyText"/>
+        <w:bidi w:val="0"/>
+        <w:spacing w:lineRule="auto" w:line="288" w:before="0" w:after="0"/>
+        <w:ind w:hanging="0" w:start="0" w:end="0"/>
+        <w:rPr>
+          <w:rFonts w:cs="Noto Serif Thai"/>
+          <w:sz w:val="32"/>
+          <w:szCs w:val="32"/>
+          <w:lang w:bidi="th-TH"/>
+        </w:rPr>
+      </w:pPr>
+      <w:r>
+        <w:rPr>
+          <w:rFonts w:cs="Noto Serif Thai"/>
+          <w:sz w:val="32"/>
+          <w:szCs w:val="32"/>
+          <w:lang w:bidi="th-TH"/>
+        </w:rPr>
+      </w:r>
+    </w:p>
+    <w:p>
+      <w:pPr>
+        <w:pStyle w:val="BodyText"/>
+        <w:bidi w:val="0"/>
+        <w:spacing w:lineRule="auto" w:line="288" w:before="0" w:after="0"/>
+        <w:ind w:hanging="0" w:start="0" w:end="0"/>
+        <w:rPr>
+          <w:rFonts w:cs="Noto Serif Thai"/>
+          <w:sz w:val="32"/>
+          <w:szCs w:val="32"/>
+          <w:lang w:bidi="th-TH"/>
+        </w:rPr>
+      </w:pPr>
+      <w:r>
+        <w:rPr>
+          <w:rFonts w:cs="Noto Serif Thai"/>
+          <w:sz w:val="32"/>
+          <w:szCs w:val="32"/>
+          <w:lang w:bidi="th-TH"/>
+        </w:rPr>
+        <w:t>ว่ากันตามตรงแล้ว หากฟางหยวนอยากจะโกง เขาก็รู้วิธีมากมาย</w:t>
+      </w:r>
+      <w:r>
+        <w:rPr>
+          <w:rFonts w:cs="Noto Serif Thai"/>
+          <w:sz w:val="32"/>
+          <w:szCs w:val="32"/>
+          <w:lang w:bidi="th-TH"/>
+        </w:rPr>
+        <w:t>ที่จะทำมัน</w:t>
+      </w:r>
+      <w:r>
+        <w:rPr>
+          <w:rFonts w:cs="Noto Serif Thai"/>
+          <w:sz w:val="32"/>
+          <w:szCs w:val="32"/>
+          <w:lang w:bidi="th-TH"/>
+        </w:rPr>
+        <w:t xml:space="preserve"> </w:t>
+      </w:r>
+      <w:r>
+        <w:rPr>
+          <w:rFonts w:cs="Noto Serif Thai"/>
+          <w:sz w:val="32"/>
+          <w:szCs w:val="32"/>
+          <w:lang w:bidi="th-TH"/>
+        </w:rPr>
+        <w:t>ซึ่ง</w:t>
+      </w:r>
+      <w:r>
+        <w:rPr>
+          <w:rFonts w:cs="Noto Serif Thai"/>
+          <w:sz w:val="32"/>
+          <w:szCs w:val="32"/>
+          <w:lang w:bidi="th-TH"/>
+        </w:rPr>
+        <w:t>บาง</w:t>
+      </w:r>
+      <w:r>
+        <w:rPr>
+          <w:rFonts w:cs="Noto Serif Thai"/>
+          <w:sz w:val="32"/>
+          <w:szCs w:val="32"/>
+          <w:lang w:bidi="th-TH"/>
+        </w:rPr>
+        <w:t>แผน</w:t>
+      </w:r>
+      <w:r>
+        <w:rPr>
+          <w:rFonts w:cs="Noto Serif Thai"/>
+          <w:sz w:val="32"/>
+          <w:szCs w:val="32"/>
+          <w:lang w:bidi="th-TH"/>
+        </w:rPr>
+        <w:t>ก็สมบูรณ์แบบเสียยิ่งกว่าวิธีของกู่เยว่ชื่อเฉิงอีก ถ้า</w:t>
+      </w:r>
+      <w:r>
+        <w:rPr>
+          <w:rFonts w:cs="Noto Serif Thai"/>
+          <w:sz w:val="32"/>
+          <w:szCs w:val="32"/>
+          <w:lang w:bidi="th-TH"/>
+        </w:rPr>
+        <w:t>ผู้ใดมีพรสวรรค์ชั้นสองหรือหนึ่ง คนผู้นั้นก็จะได้รับการดูแลอย่างดี</w:t>
+      </w:r>
+    </w:p>
+    <w:p>
+      <w:pPr>
+        <w:pStyle w:val="BodyText"/>
+        <w:bidi w:val="0"/>
+        <w:spacing w:lineRule="auto" w:line="288" w:before="0" w:after="0"/>
+        <w:ind w:hanging="0" w:start="0" w:end="0"/>
+        <w:rPr>
+          <w:rFonts w:cs="Noto Serif Thai"/>
+          <w:sz w:val="32"/>
+          <w:szCs w:val="32"/>
+          <w:lang w:bidi="th-TH"/>
+        </w:rPr>
+      </w:pPr>
+      <w:r>
+        <w:rPr>
+          <w:rFonts w:cs="Noto Serif Thai"/>
+          <w:sz w:val="32"/>
+          <w:szCs w:val="32"/>
+          <w:lang w:bidi="th-TH"/>
+        </w:rPr>
+      </w:r>
+    </w:p>
+    <w:p>
+      <w:pPr>
+        <w:pStyle w:val="BodyText"/>
+        <w:bidi w:val="0"/>
+        <w:spacing w:lineRule="auto" w:line="288" w:before="0" w:after="0"/>
+        <w:ind w:hanging="0" w:start="0" w:end="0"/>
+        <w:rPr>
+          <w:rFonts w:cs="Noto Serif Thai"/>
+          <w:sz w:val="32"/>
+          <w:szCs w:val="32"/>
+          <w:lang w:bidi="th-TH"/>
+        </w:rPr>
+      </w:pPr>
+      <w:r>
+        <w:rPr>
+          <w:rFonts w:cs="Noto Serif Thai"/>
+          <w:sz w:val="32"/>
+          <w:szCs w:val="32"/>
+          <w:lang w:bidi="th-TH"/>
+        </w:rPr>
+        <w:t>แต่ก่อนอื่นเลยเป็นเพราะว่าฟางหยวนพึ่งย้อนเวลากลับมา มันจึงยากที่เขาจะเตรียมแผนการโกงด้วยสภาพเช่นนี้ อย่างที่สองคือแม้เขาจะโกงผลลัพธ์ของพิธีได้ แต่เขาไม่สามารถโกงความเร็วในการบ่มเพาะพลังได้ สุดท้ายแล้วเขาจะถูกเปิดโปงอยู่ดี</w:t>
+      </w:r>
+    </w:p>
+    <w:p>
+      <w:pPr>
+        <w:pStyle w:val="BodyText"/>
+        <w:bidi w:val="0"/>
+        <w:spacing w:lineRule="auto" w:line="288" w:before="0" w:after="0"/>
+        <w:ind w:hanging="0" w:start="0" w:end="0"/>
+        <w:rPr>
+          <w:rFonts w:cs="Noto Serif Thai"/>
+          <w:sz w:val="32"/>
+          <w:szCs w:val="32"/>
+          <w:lang w:bidi="th-TH"/>
+        </w:rPr>
+      </w:pPr>
+      <w:r>
+        <w:rPr>
+          <w:rFonts w:cs="Noto Serif Thai"/>
+          <w:sz w:val="32"/>
+          <w:szCs w:val="32"/>
+          <w:lang w:bidi="th-TH"/>
+        </w:rPr>
+      </w:r>
+    </w:p>
+    <w:p>
+      <w:pPr>
+        <w:pStyle w:val="BodyText"/>
+        <w:bidi w:val="0"/>
+        <w:spacing w:lineRule="auto" w:line="288" w:before="0" w:after="0"/>
+        <w:ind w:hanging="0" w:start="0" w:end="0"/>
+        <w:rPr>
+          <w:rFonts w:cs="Noto Serif Thai"/>
+          <w:sz w:val="32"/>
+          <w:szCs w:val="32"/>
+          <w:lang w:bidi="th-TH"/>
+        </w:rPr>
+      </w:pPr>
+      <w:r>
+        <w:rPr>
+          <w:rFonts w:cs="Noto Serif Thai"/>
+          <w:sz w:val="32"/>
+          <w:szCs w:val="32"/>
+          <w:lang w:bidi="th-TH"/>
+        </w:rPr>
+        <w:t>อย่างไรก็ตาม กู่เยว่ชื่อเฉิงนั้นแตกต่าง ปู่ของเขาคือกู่เยว่ชื่อเลี่ยน หนึ่งในสองผู้อาวุโสผู้มีอำนาจมากที่สุดในตระกูล ฉะนั้นชื่อเลี่ยนจึงปกปิดให้หลานชายของตัวเองได้</w:t>
+      </w:r>
+    </w:p>
+    <w:p>
+      <w:pPr>
+        <w:pStyle w:val="BodyText"/>
+        <w:bidi w:val="0"/>
+        <w:spacing w:lineRule="auto" w:line="288" w:before="0" w:after="0"/>
+        <w:ind w:hanging="0" w:start="0" w:end="0"/>
+        <w:rPr>
+          <w:rFonts w:cs="Noto Serif Thai"/>
+          <w:sz w:val="32"/>
+          <w:szCs w:val="32"/>
+          <w:lang w:bidi="th-TH"/>
+        </w:rPr>
+      </w:pPr>
+      <w:r>
+        <w:rPr>
+          <w:rFonts w:cs="Noto Serif Thai"/>
+          <w:sz w:val="32"/>
+          <w:szCs w:val="32"/>
+          <w:lang w:bidi="th-TH"/>
+        </w:rPr>
+      </w:r>
+    </w:p>
+    <w:p>
+      <w:pPr>
+        <w:pStyle w:val="BodyText"/>
+        <w:bidi w:val="0"/>
+        <w:spacing w:lineRule="auto" w:line="288" w:before="0" w:after="0"/>
+        <w:ind w:hanging="0" w:start="0" w:end="0"/>
+        <w:rPr>
+          <w:rFonts w:cs="Noto Serif Thai"/>
+          <w:sz w:val="32"/>
+          <w:szCs w:val="32"/>
+          <w:lang w:bidi="th-TH"/>
+        </w:rPr>
+      </w:pPr>
+      <w:r>
+        <w:rPr>
+          <w:rFonts w:cs="Noto Serif Thai"/>
+          <w:sz w:val="32"/>
+          <w:szCs w:val="32"/>
+          <w:lang w:bidi="th-TH"/>
+        </w:rPr>
+        <w:t>“</w:t>
+      </w:r>
+      <w:r>
+        <w:rPr>
+          <w:rFonts w:cs="Noto Serif Thai"/>
+          <w:sz w:val="32"/>
+          <w:szCs w:val="32"/>
+          <w:lang w:bidi="th-TH"/>
+        </w:rPr>
+        <w:t>กู่เยว่ชื่อเลี่ยนมักจะเป็นปฏิปักษ์ต่อกู่เยว่โม่เฉินอยู่เสมอ ผู้อาวุโสทั้งสองท่านนี้ต่างเป็นผู้มีอิทธิพลสูงสุดภายในตระกูล การจะสยบคู่แข่งได้นั้น เขาจำเป็นต้องอาศัยหลานชายที่มีพรสวรรค์อันโดดเด่น และด้วยการหนุนหลังอย่างลับๆ จากเขานี่เอง ที่ทำให้กู่เยว่ชื่อเฉิงสามารถปกปิดความจริงเอาไว้ได้ระยะหนึ่ง ในความทรงจำของข้า หากมิใช่เพราะเหตุการณ์ครั้งนั้น ความจริงก็คงไม่มีวันถูกเปิดเผยออกมา”</w:t>
+      </w:r>
+    </w:p>
+    <w:p>
+      <w:pPr>
+        <w:pStyle w:val="BodyText"/>
+        <w:bidi w:val="0"/>
+        <w:spacing w:lineRule="auto" w:line="288" w:before="0" w:after="0"/>
+        <w:ind w:hanging="0" w:start="0" w:end="0"/>
+        <w:rPr>
+          <w:rFonts w:cs="Noto Serif Thai"/>
+          <w:sz w:val="32"/>
+          <w:szCs w:val="32"/>
+          <w:lang w:bidi="th-TH"/>
+        </w:rPr>
+      </w:pPr>
+      <w:r>
+        <w:rPr>
+          <w:rFonts w:cs="Noto Serif Thai"/>
+          <w:sz w:val="32"/>
+          <w:szCs w:val="32"/>
+          <w:lang w:bidi="th-TH"/>
+        </w:rPr>
+      </w:r>
+    </w:p>
+    <w:p>
+      <w:pPr>
+        <w:pStyle w:val="BodyText"/>
+        <w:bidi w:val="0"/>
+        <w:spacing w:lineRule="auto" w:line="288" w:before="0" w:after="0"/>
+        <w:ind w:hanging="0" w:start="0" w:end="0"/>
+        <w:rPr>
+          <w:rFonts w:cs="Noto Serif Thai"/>
+          <w:sz w:val="32"/>
+          <w:szCs w:val="32"/>
+          <w:lang w:bidi="th-TH"/>
+        </w:rPr>
+      </w:pPr>
+      <w:r>
+        <w:rPr>
+          <w:rFonts w:cs="Noto Serif Thai"/>
+          <w:sz w:val="32"/>
+          <w:szCs w:val="32"/>
+          <w:lang w:bidi="th-TH"/>
+        </w:rPr>
+        <w:t>ดวงตาของฟางหยวนเป็นประกาย สมองของเขาโลดแล่นเพื่อคิดค้นหลายวิธีที่จะนำความรู้นี้มาใช้ประโยชน์</w:t>
+      </w:r>
+    </w:p>
+    <w:p>
+      <w:pPr>
+        <w:pStyle w:val="BodyText"/>
+        <w:bidi w:val="0"/>
+        <w:spacing w:lineRule="auto" w:line="288" w:before="0" w:after="0"/>
+        <w:ind w:hanging="0" w:start="0" w:end="0"/>
+        <w:rPr>
+          <w:rFonts w:cs="Noto Serif Thai"/>
+          <w:sz w:val="32"/>
+          <w:szCs w:val="32"/>
+          <w:lang w:bidi="th-TH"/>
+        </w:rPr>
+      </w:pPr>
+      <w:r>
+        <w:rPr>
+          <w:rFonts w:cs="Noto Serif Thai"/>
+          <w:sz w:val="32"/>
+          <w:szCs w:val="32"/>
+          <w:lang w:bidi="th-TH"/>
+        </w:rPr>
+      </w:r>
+    </w:p>
+    <w:p>
+      <w:pPr>
+        <w:pStyle w:val="BodyText"/>
+        <w:bidi w:val="0"/>
+        <w:spacing w:lineRule="auto" w:line="288" w:before="0" w:after="0"/>
+        <w:ind w:hanging="0" w:start="0" w:end="0"/>
+        <w:rPr>
+          <w:rFonts w:cs="Noto Serif Thai"/>
+          <w:sz w:val="32"/>
+          <w:szCs w:val="32"/>
+          <w:lang w:bidi="th-TH"/>
+        </w:rPr>
+      </w:pPr>
+      <w:r>
+        <w:rPr>
+          <w:rFonts w:cs="Noto Serif Thai"/>
+          <w:sz w:val="32"/>
+          <w:szCs w:val="32"/>
+          <w:lang w:bidi="th-TH"/>
+        </w:rPr>
+        <w:t>ถ้าเขาเปิดโปงมันเสียตั้งแต่ตอนนี้ เขาคงจะได้รางวัลเล็กน้อยจากตระกูล แต่เขาก็ทำให้กู่เยว่ชื่อเลี่ยนที่ทรงอำนาจ</w:t>
+      </w:r>
+      <w:r>
+        <w:rPr>
+          <w:rFonts w:cs="Noto Serif Thai"/>
+          <w:sz w:val="32"/>
+          <w:szCs w:val="32"/>
+          <w:lang w:bidi="th-TH"/>
+        </w:rPr>
+        <w:t>ขุ่</w:t>
+      </w:r>
+      <w:r>
+        <w:rPr>
+          <w:rFonts w:cs="Noto Serif Thai"/>
+          <w:sz w:val="32"/>
+          <w:szCs w:val="32"/>
+          <w:lang w:bidi="th-TH"/>
+        </w:rPr>
+        <w:t>นเคือง นั้นไม่เหมาะจะทำเท่าไหร่</w:t>
+      </w:r>
+    </w:p>
+    <w:p>
+      <w:pPr>
+        <w:pStyle w:val="BodyText"/>
+        <w:bidi w:val="0"/>
+        <w:spacing w:lineRule="auto" w:line="288" w:before="0" w:after="0"/>
+        <w:ind w:hanging="0" w:start="0" w:end="0"/>
+        <w:rPr>
+          <w:rFonts w:cs="Noto Serif Thai"/>
+          <w:sz w:val="32"/>
+          <w:szCs w:val="32"/>
+          <w:lang w:bidi="th-TH"/>
+        </w:rPr>
+      </w:pPr>
+      <w:r>
+        <w:rPr>
+          <w:rFonts w:cs="Noto Serif Thai"/>
+          <w:sz w:val="32"/>
+          <w:szCs w:val="32"/>
+          <w:lang w:bidi="th-TH"/>
+        </w:rPr>
+      </w:r>
+    </w:p>
+    <w:p>
+      <w:pPr>
+        <w:pStyle w:val="BodyText"/>
+        <w:bidi w:val="0"/>
+        <w:spacing w:lineRule="auto" w:line="288" w:before="0" w:after="0"/>
+        <w:ind w:hanging="0" w:start="0" w:end="0"/>
+        <w:rPr>
+          <w:rFonts w:cs="Noto Serif Thai"/>
+          <w:sz w:val="32"/>
+          <w:szCs w:val="32"/>
+          <w:lang w:bidi="th-TH"/>
+        </w:rPr>
+      </w:pPr>
+      <w:r>
+        <w:rPr>
+          <w:rFonts w:cs="Noto Serif Thai"/>
+          <w:sz w:val="32"/>
+          <w:szCs w:val="32"/>
+          <w:lang w:bidi="th-TH"/>
+        </w:rPr>
+        <w:t>ด้วยเวลาอันสั้นเช่นนี้ เขาไม่สามารถขู่กระโชกได้เพราะสถานะของเขายังต่ำ หากทำผลลัพธ์จะตีกลับมาโจมตีเขาเสียเอง</w:t>
+      </w:r>
+    </w:p>
+    <w:p>
+      <w:pPr>
+        <w:pStyle w:val="BodyText"/>
+        <w:bidi w:val="0"/>
+        <w:spacing w:lineRule="auto" w:line="288" w:before="0" w:after="0"/>
+        <w:ind w:hanging="0" w:start="0" w:end="0"/>
+        <w:rPr>
+          <w:rFonts w:cs="Noto Serif Thai"/>
+          <w:sz w:val="32"/>
+          <w:szCs w:val="32"/>
+          <w:lang w:bidi="th-TH"/>
+        </w:rPr>
+      </w:pPr>
+      <w:r>
+        <w:rPr>
+          <w:rFonts w:cs="Noto Serif Thai"/>
+          <w:sz w:val="32"/>
+          <w:szCs w:val="32"/>
+          <w:lang w:bidi="th-TH"/>
+        </w:rPr>
+      </w:r>
+    </w:p>
+    <w:p>
+      <w:pPr>
+        <w:pStyle w:val="BodyText"/>
+        <w:bidi w:val="0"/>
+        <w:spacing w:lineRule="auto" w:line="288" w:before="0" w:after="0"/>
+        <w:ind w:hanging="0" w:start="0" w:end="0"/>
+        <w:rPr>
+          <w:rFonts w:cs="Noto Serif Thai"/>
+          <w:sz w:val="32"/>
+          <w:szCs w:val="32"/>
+          <w:lang w:bidi="th-TH"/>
+        </w:rPr>
+      </w:pPr>
+      <w:r>
+        <w:rPr>
+          <w:rFonts w:cs="Noto Serif Thai"/>
+          <w:sz w:val="32"/>
+          <w:szCs w:val="32"/>
+          <w:lang w:bidi="th-TH"/>
+        </w:rPr>
+        <w:t>ใน</w:t>
+      </w:r>
+      <w:r>
+        <w:rPr>
+          <w:rFonts w:cs="Noto Serif Thai"/>
+          <w:sz w:val="32"/>
+          <w:szCs w:val="32"/>
+          <w:lang w:bidi="th-TH"/>
+        </w:rPr>
+        <w:t>จังหวะที่</w:t>
+      </w:r>
+      <w:r>
+        <w:rPr>
+          <w:rFonts w:cs="Noto Serif Thai"/>
+          <w:sz w:val="32"/>
+          <w:szCs w:val="32"/>
+          <w:lang w:bidi="th-TH"/>
+        </w:rPr>
+        <w:t xml:space="preserve">กำลังครุ่นคิด </w:t>
+      </w:r>
+      <w:r>
+        <w:rPr>
+          <w:rFonts w:cs="Noto Serif Thai"/>
+          <w:sz w:val="32"/>
+          <w:szCs w:val="32"/>
+          <w:lang w:bidi="th-TH"/>
+        </w:rPr>
+        <w:t>ฟางหยวนได้ยินเสียงเรียกชื่อของเขาของผู้อาวุโสจากสถาบัน “กู่เยว่ฟางหยวน</w:t>
+      </w:r>
+      <w:r>
+        <w:rPr>
+          <w:rFonts w:cs="Noto Serif Thai"/>
+          <w:sz w:val="32"/>
+          <w:szCs w:val="32"/>
+          <w:lang w:bidi="th-TH"/>
+        </w:rPr>
+        <w:t>!”</w:t>
+      </w:r>
+    </w:p>
+    <w:p>
+      <w:pPr>
+        <w:pStyle w:val="HorizontalLine"/>
+        <w:rPr/>
+      </w:pPr>
+      <w:r>
+        <w:rPr/>
+      </w:r>
+    </w:p>
+    <w:p>
+      <w:pPr>
+        <w:pStyle w:val="BodyText"/>
+        <w:numPr>
+          <w:ilvl w:val="0"/>
+          <w:numId w:val="3"/>
+        </w:numPr>
+        <w:bidi w:val="0"/>
+        <w:spacing w:before="0" w:after="140"/>
+        <w:jc w:val="start"/>
+        <w:rPr>
+          <w:rFonts w:cs="Noto Sans Thai"/>
+          <w:sz w:val="28"/>
+          <w:szCs w:val="28"/>
+          <w:lang w:bidi="th-TH"/>
+        </w:rPr>
+      </w:pPr>
+      <w:r>
+        <w:rPr>
+          <w:rFonts w:cs="Noto Sans Thai"/>
+          <w:sz w:val="25"/>
+          <w:szCs w:val="28"/>
+          <w:lang w:bidi="th-TH"/>
+        </w:rPr>
+        <w:t>ร</w:t>
+      </w:r>
+      <w:r>
+        <w:rPr>
+          <w:rFonts w:cs="Noto Sans Thai"/>
+          <w:sz w:val="25"/>
+          <w:szCs w:val="28"/>
+        </w:rPr>
+        <w:t xml:space="preserve">ะบบการแบ่งห้องเรียนของจีนโบราณมักใช้อักษร </w:t>
+      </w:r>
+      <w:r>
+        <w:rPr>
+          <w:rFonts w:cs="Noto Sans Thai"/>
+          <w:sz w:val="25"/>
+          <w:szCs w:val="28"/>
+        </w:rPr>
+        <w:t xml:space="preserve">甲乙丙丁 </w:t>
+      </w:r>
+      <w:r>
+        <w:rPr>
+          <w:rFonts w:cs="Noto Sans Thai"/>
+          <w:sz w:val="25"/>
+          <w:szCs w:val="28"/>
+        </w:rPr>
+        <w:t>(</w:t>
+      </w:r>
+      <w:r>
+        <w:rPr>
+          <w:rFonts w:cs="Noto Sans Thai"/>
+          <w:sz w:val="25"/>
+          <w:szCs w:val="28"/>
+        </w:rPr>
+        <w:t>เจี่ย</w:t>
+      </w:r>
+      <w:r>
+        <w:rPr>
+          <w:rFonts w:cs="Noto Sans Thai"/>
+          <w:sz w:val="25"/>
+          <w:szCs w:val="28"/>
+        </w:rPr>
+        <w:t>-</w:t>
+      </w:r>
+      <w:r>
+        <w:rPr>
+          <w:rFonts w:cs="Noto Sans Thai"/>
+          <w:sz w:val="25"/>
+          <w:szCs w:val="28"/>
+        </w:rPr>
+        <w:t>อี้</w:t>
+      </w:r>
+      <w:r>
+        <w:rPr>
+          <w:rFonts w:cs="Noto Sans Thai"/>
+          <w:sz w:val="25"/>
+          <w:szCs w:val="28"/>
+        </w:rPr>
+        <w:t>-</w:t>
+      </w:r>
+      <w:r>
+        <w:rPr>
+          <w:rFonts w:cs="Noto Sans Thai"/>
+          <w:sz w:val="25"/>
+          <w:szCs w:val="28"/>
+        </w:rPr>
+        <w:t>ปิ่ง</w:t>
+      </w:r>
+      <w:r>
+        <w:rPr>
+          <w:rFonts w:cs="Noto Sans Thai"/>
+          <w:sz w:val="25"/>
+          <w:szCs w:val="28"/>
+        </w:rPr>
+        <w:t>-</w:t>
+      </w:r>
+      <w:r>
+        <w:rPr>
+          <w:rFonts w:cs="Noto Sans Thai"/>
+          <w:sz w:val="25"/>
+          <w:szCs w:val="28"/>
+        </w:rPr>
+        <w:t>ติง</w:t>
+      </w:r>
+      <w:r>
+        <w:rPr>
+          <w:rFonts w:cs="Noto Sans Thai"/>
+          <w:sz w:val="25"/>
+          <w:szCs w:val="28"/>
+        </w:rPr>
+        <w:t xml:space="preserve">) </w:t>
+      </w:r>
+      <w:r>
+        <w:rPr>
+          <w:rFonts w:cs="Noto Sans Thai"/>
+          <w:sz w:val="25"/>
+          <w:szCs w:val="28"/>
+        </w:rPr>
+        <w:t xml:space="preserve">ซึ่งเทียบเท่ากับ </w:t>
+      </w:r>
+      <w:r>
+        <w:rPr>
+          <w:rFonts w:cs="Noto Sans Thai"/>
+          <w:sz w:val="25"/>
+          <w:szCs w:val="28"/>
+        </w:rPr>
+        <w:t xml:space="preserve">A-B-C-D </w:t>
+      </w:r>
+      <w:r>
+        <w:rPr>
+          <w:rFonts w:cs="Noto Sans Thai"/>
+          <w:sz w:val="25"/>
+          <w:szCs w:val="28"/>
+        </w:rPr>
+        <w:t xml:space="preserve">ดังนั้น ห้องอี้จึงหมายถึงห้องเรียนระดับ </w:t>
+      </w:r>
+      <w:r>
+        <w:rPr>
+          <w:rFonts w:cs="Noto Sans Thai"/>
+          <w:sz w:val="25"/>
+          <w:szCs w:val="28"/>
+        </w:rPr>
+        <w:t>B (</w:t>
+      </w:r>
+      <w:r>
+        <w:rPr>
+          <w:rFonts w:cs="Noto Sans Thai"/>
+          <w:sz w:val="25"/>
+          <w:szCs w:val="28"/>
+        </w:rPr>
+        <w:t>สำหรับเด็กที่มีพรสวรรค์ระดับสอง</w:t>
+      </w:r>
+      <w:r>
+        <w:rPr>
+          <w:rFonts w:cs="Noto Sans Thai"/>
+          <w:sz w:val="25"/>
+          <w:szCs w:val="28"/>
+        </w:rPr>
+        <w:t>)</w:t>
       </w:r>
     </w:p>
     <w:sectPr>
@@ -19696,6 +21920,143 @@
   <w:abstractNum w:abstractNumId="3">
     <w:lvl w:ilvl="0">
       <w:start w:val="1"/>
+      <w:numFmt w:val="bullet"/>
+      <w:lvlText w:val=""/>
+      <w:lvlJc w:val="start"/>
+      <w:pPr>
+        <w:tabs>
+          <w:tab w:val="num" w:pos="720"/>
+        </w:tabs>
+        <w:ind w:start="720" w:hanging="360"/>
+      </w:pPr>
+      <w:rPr>
+        <w:rFonts w:ascii="Symbol" w:hAnsi="Symbol" w:cs="Symbol" w:hint="default"/>
+      </w:rPr>
+    </w:lvl>
+    <w:lvl w:ilvl="1">
+      <w:start w:val="1"/>
+      <w:numFmt w:val="bullet"/>
+      <w:lvlText w:val=""/>
+      <w:lvlJc w:val="start"/>
+      <w:pPr>
+        <w:tabs>
+          <w:tab w:val="num" w:pos="1080"/>
+        </w:tabs>
+        <w:ind w:start="1080" w:hanging="360"/>
+      </w:pPr>
+      <w:rPr>
+        <w:rFonts w:ascii="Symbol" w:hAnsi="Symbol" w:cs="Symbol" w:hint="default"/>
+      </w:rPr>
+    </w:lvl>
+    <w:lvl w:ilvl="2">
+      <w:start w:val="1"/>
+      <w:numFmt w:val="bullet"/>
+      <w:lvlText w:val=""/>
+      <w:lvlJc w:val="start"/>
+      <w:pPr>
+        <w:tabs>
+          <w:tab w:val="num" w:pos="1440"/>
+        </w:tabs>
+        <w:ind w:start="1440" w:hanging="360"/>
+      </w:pPr>
+      <w:rPr>
+        <w:rFonts w:ascii="Symbol" w:hAnsi="Symbol" w:cs="Symbol" w:hint="default"/>
+      </w:rPr>
+    </w:lvl>
+    <w:lvl w:ilvl="3">
+      <w:start w:val="1"/>
+      <w:numFmt w:val="bullet"/>
+      <w:lvlText w:val=""/>
+      <w:lvlJc w:val="start"/>
+      <w:pPr>
+        <w:tabs>
+          <w:tab w:val="num" w:pos="1800"/>
+        </w:tabs>
+        <w:ind w:start="1800" w:hanging="360"/>
+      </w:pPr>
+      <w:rPr>
+        <w:rFonts w:ascii="Symbol" w:hAnsi="Symbol" w:cs="Symbol" w:hint="default"/>
+      </w:rPr>
+    </w:lvl>
+    <w:lvl w:ilvl="4">
+      <w:start w:val="1"/>
+      <w:numFmt w:val="bullet"/>
+      <w:lvlText w:val=""/>
+      <w:lvlJc w:val="start"/>
+      <w:pPr>
+        <w:tabs>
+          <w:tab w:val="num" w:pos="2160"/>
+        </w:tabs>
+        <w:ind w:start="2160" w:hanging="360"/>
+      </w:pPr>
+      <w:rPr>
+        <w:rFonts w:ascii="Symbol" w:hAnsi="Symbol" w:cs="Symbol" w:hint="default"/>
+      </w:rPr>
+    </w:lvl>
+    <w:lvl w:ilvl="5">
+      <w:start w:val="1"/>
+      <w:numFmt w:val="bullet"/>
+      <w:lvlText w:val=""/>
+      <w:lvlJc w:val="start"/>
+      <w:pPr>
+        <w:tabs>
+          <w:tab w:val="num" w:pos="2520"/>
+        </w:tabs>
+        <w:ind w:start="2520" w:hanging="360"/>
+      </w:pPr>
+      <w:rPr>
+        <w:rFonts w:ascii="Symbol" w:hAnsi="Symbol" w:cs="Symbol" w:hint="default"/>
+      </w:rPr>
+    </w:lvl>
+    <w:lvl w:ilvl="6">
+      <w:start w:val="1"/>
+      <w:numFmt w:val="bullet"/>
+      <w:lvlText w:val=""/>
+      <w:lvlJc w:val="start"/>
+      <w:pPr>
+        <w:tabs>
+          <w:tab w:val="num" w:pos="2880"/>
+        </w:tabs>
+        <w:ind w:start="2880" w:hanging="360"/>
+      </w:pPr>
+      <w:rPr>
+        <w:rFonts w:ascii="Symbol" w:hAnsi="Symbol" w:cs="Symbol" w:hint="default"/>
+      </w:rPr>
+    </w:lvl>
+    <w:lvl w:ilvl="7">
+      <w:start w:val="1"/>
+      <w:numFmt w:val="bullet"/>
+      <w:lvlText w:val=""/>
+      <w:lvlJc w:val="start"/>
+      <w:pPr>
+        <w:tabs>
+          <w:tab w:val="num" w:pos="3240"/>
+        </w:tabs>
+        <w:ind w:start="3240" w:hanging="360"/>
+      </w:pPr>
+      <w:rPr>
+        <w:rFonts w:ascii="Symbol" w:hAnsi="Symbol" w:cs="Symbol" w:hint="default"/>
+      </w:rPr>
+    </w:lvl>
+    <w:lvl w:ilvl="8">
+      <w:start w:val="1"/>
+      <w:numFmt w:val="bullet"/>
+      <w:lvlText w:val=""/>
+      <w:lvlJc w:val="start"/>
+      <w:pPr>
+        <w:tabs>
+          <w:tab w:val="num" w:pos="3600"/>
+        </w:tabs>
+        <w:ind w:start="3600" w:hanging="360"/>
+      </w:pPr>
+      <w:rPr>
+        <w:rFonts w:ascii="Symbol" w:hAnsi="Symbol" w:cs="Symbol" w:hint="default"/>
+      </w:rPr>
+    </w:lvl>
+  </w:abstractNum>
+  <w:abstractNum w:abstractNumId="4">
+    <w:lvl w:ilvl="0">
+      <w:start w:val="1"/>
       <w:numFmt w:val="none"/>
       <w:suff w:val="nothing"/>
       <w:lvlText w:val=""/>
@@ -19820,6 +22181,9 @@
   </w:num>
   <w:num w:numId="3">
     <w:abstractNumId w:val="3"/>
+  </w:num>
+  <w:num w:numId="4">
+    <w:abstractNumId w:val="4"/>
   </w:num>
 </w:numbering>
 </file>
@@ -19848,7 +22212,7 @@
     <w:pPr>
       <w:widowControl/>
       <w:suppressAutoHyphens w:val="true"/>
-      <w:overflowPunct w:val="true"/>
+      <w:overflowPunct w:val="false"/>
       <w:bidi w:val="0"/>
       <w:spacing w:before="0" w:after="0"/>
       <w:jc w:val="start"/>
@@ -19909,6 +22273,13 @@
     <w:rPr>
       <w:b/>
       <w:bCs/>
+    </w:rPr>
+  </w:style>
+  <w:style w:type="character" w:styleId="Bulletsuser">
+    <w:name w:val="Bullets (user)"/>
+    <w:qFormat/>
+    <w:rPr>
+      <w:rFonts w:ascii="OpenSymbol" w:hAnsi="OpenSymbol" w:eastAsia="OpenSymbol" w:cs="OpenSymbol"/>
     </w:rPr>
   </w:style>
   <w:style w:type="character" w:styleId="Bullets">

</xml_diff>